<commit_message>
Consolida relatorio executivo de Leonardo e revisao de Lucas
</commit_message>
<xml_diff>
--- a/fase2/Relatorio_Executivo_Fase2_Olist_RASCUNHO.docx
+++ b/fase2/Relatorio_Executivo_Fase2_Olist_RASCUNHO.docx
@@ -50,7 +50,7 @@
           <w:color w:val="2A78D6"/>
           <w:sz w:val="24"/>
         </w:rPr>
-        <w:t>Versão 2.0 · evolução do relatório da Fase 1 com os entregáveis da Fase 2</w:t>
+        <w:t>Versão 2.1 · consolidação executiva V5 e revisão técnica da Fase 2</w:t>
       </w:r>
     </w:p>
     <w:p>
@@ -78,7 +78,7 @@
           <w:color w:val="52514E"/>
           <w:sz w:val="20"/>
         </w:rPr>
-        <w:t>Versão rascunho para revisão do grupo · 27 de outubro de 2026</w:t>
+        <w:t>Versão rascunho para revisão do grupo · 20 de outubro de 2026</w:t>
       </w:r>
     </w:p>
     <w:p>
@@ -456,7 +456,7 @@
                 <w:b/>
                 <w:sz w:val="17"/>
               </w:rPr>
-              <w:t>27/10/2026</w:t>
+              <w:t>19/10/2026</w:t>
             </w:r>
           </w:p>
         </w:tc>
@@ -491,7 +491,83 @@
               <w:rPr>
                 <w:sz w:val="17"/>
               </w:rPr>
-              <w:t>Este documento: Fase 1 revisada + priorização, casos de uso detalhados, jornadas, prompts v2 e business case</w:t>
+              <w:t>Fase 1 revisada + priorização, casos de uso detalhados, jornadas, prompts v2 e business case</w:t>
+            </w:r>
+          </w:p>
+        </w:tc>
+      </w:tr>
+      <w:tr>
+        <w:trPr>
+          <w:cantSplit w:val="true"/>
+        </w:trPr>
+        <w:tc>
+          <w:tcPr>
+            <w:tcW w:type="dxa" w:w="471"/>
+          </w:tcPr>
+          <w:p>
+            <w:pPr>
+              <w:spacing w:after="0" w:line="240" w:lineRule="auto"/>
+            </w:pPr>
+            <w:r/>
+            <w:r>
+              <w:rPr>
+                <w:b/>
+                <w:sz w:val="17"/>
+              </w:rPr>
+              <w:t>2.1</w:t>
+            </w:r>
+          </w:p>
+        </w:tc>
+        <w:tc>
+          <w:tcPr>
+            <w:tcW w:type="dxa" w:w="785"/>
+          </w:tcPr>
+          <w:p>
+            <w:pPr>
+              <w:spacing w:after="0" w:line="240" w:lineRule="auto"/>
+            </w:pPr>
+            <w:r/>
+            <w:r>
+              <w:rPr>
+                <w:b/>
+                <w:sz w:val="17"/>
+              </w:rPr>
+              <w:t>19/10/2026</w:t>
+            </w:r>
+          </w:p>
+        </w:tc>
+        <w:tc>
+          <w:tcPr>
+            <w:tcW w:type="dxa" w:w="4237"/>
+          </w:tcPr>
+          <w:p>
+            <w:pPr>
+              <w:spacing w:after="0" w:line="240" w:lineRule="auto"/>
+            </w:pPr>
+            <w:r/>
+            <w:r>
+              <w:rPr>
+                <w:b/>
+                <w:sz w:val="17"/>
+              </w:rPr>
+              <w:t>Fase 2 · Revisão final de consistência</w:t>
+            </w:r>
+          </w:p>
+        </w:tc>
+        <w:tc>
+          <w:tcPr>
+            <w:tcW w:type="dxa" w:w="4707"/>
+          </w:tcPr>
+          <w:p>
+            <w:pPr>
+              <w:spacing w:after="0" w:line="240" w:lineRule="auto"/>
+            </w:pPr>
+            <w:r/>
+            <w:r>
+              <w:rPr>
+                <w:sz w:val="17"/>
+              </w:rPr>
+              <w:t>Alinhamento à apresentação V5; qualificação de saídas ilustrativas; separação entre histórico e simulação; revisão de promessas operacionais e referências internas, sem recalcular indicadores</w:t>
             </w:r>
           </w:p>
         </w:tc>
@@ -915,6 +991,28 @@
         <w:rPr>
           <w:b/>
         </w:rPr>
+        <w:t>Consolidação de 20/10/2026:</w:t>
+      </w:r>
+      <w:r>
+        <w:t xml:space="preserve"> preserva a narrativa executiva V5 do Leonardo e incorpora a revisão técnica de Lucas nas Seções 8.2–8.3, 9.2–9.3, 9.6, 10.1 e 10.3. Regras de contato, revisão humana e execução confirmada foram alinhadas; os indicadores não foram recalculados. A divisão de falas segue os blocos V5 (Lucas, slides 10–12).</w:t>
+      </w:r>
+    </w:p>
+    <w:p>
+      <w:r>
+        <w:rPr>
+          <w:b/>
+        </w:rPr>
+        <w:t>Ajustes da versão 2.1 em relação à 2.0:</w:t>
+      </w:r>
+      <w:r>
+        <w:t xml:space="preserve"> alinhamento com a apresentação V5, sem alterar números; exemplos de prompts qualificados como ilustrativos; caso multiagente separado em evidências e intervenções hipotéticas; comunicação condicionada a políticas operacionais; integração pós-entrega tratada como sinal histórico; numeração de subseções corrigida.</w:t>
+      </w:r>
+    </w:p>
+    <w:p>
+      <w:r>
+        <w:rPr>
+          <w:b/>
+        </w:rPr>
         <w:t>Correções em relação à versão 1.0:</w:t>
       </w:r>
       <w:r>
@@ -965,7 +1063,13 @@
     </w:p>
     <w:p>
       <w:r>
-        <w:t xml:space="preserve">A análise do dataset público da Olist revelou, na Fase 1, um marketplace com forte capacidade de aquisição e fricções relevantes em retenção, logística, experiência do cliente e gestão de sellers. A recompra é de apenas </w:t>
+        <w:rPr>
+          <w:b/>
+        </w:rPr>
+        <w:t>Solicitamos aprovação para desenhar e validar, em um piloto controlado de 90 dias, dois agentes — LogiPredict e SentimentDesk — em rotas selecionadas do Nordeste.</w:t>
+      </w:r>
+      <w:r>
+        <w:t xml:space="preserve"> A autorização solicitada é para uma etapa de validação operacional, não para implantação corporativa ou reconhecimento antecipado dos benefícios estimados. Esse pedido é a evolução direta do diagnóstico da Fase 1, que mapeou onde a Olist perde valor: recompra de apenas </w:t>
       </w:r>
       <w:r>
         <w:rPr>
@@ -974,7 +1078,7 @@
         <w:t>3,00%</w:t>
       </w:r>
       <w:r>
-        <w:t xml:space="preserve">; </w:t>
+        <w:t xml:space="preserve">, </w:t>
       </w:r>
       <w:r>
         <w:rPr>
@@ -983,7 +1087,7 @@
         <w:t>8,11%</w:t>
       </w:r>
       <w:r>
-        <w:t xml:space="preserve"> dos pedidos chegam após o prazo; o frete representa </w:t>
+        <w:t xml:space="preserve"> dos pedidos entregues com atraso, frete em </w:t>
       </w:r>
       <w:r>
         <w:rPr>
@@ -992,7 +1096,7 @@
         <w:t>21,34%</w:t>
       </w:r>
       <w:r>
-        <w:t xml:space="preserve"> do valor do pedido; e </w:t>
+        <w:t xml:space="preserve"> do valor do pedido e </w:t>
       </w:r>
       <w:r>
         <w:rPr>
@@ -1001,12 +1105,7 @@
         <w:t>14,7%</w:t>
       </w:r>
       <w:r>
-        <w:t xml:space="preserve"> das avaliações são notas 1 ou 2.</w:t>
-      </w:r>
-    </w:p>
-    <w:p>
-      <w:r>
-        <w:t xml:space="preserve">Na Fase 2, a diretoria aprovou a continuidade e perguntou: </w:t>
+        <w:t xml:space="preserve"> das avaliações em nota 1 ou 2. Na Fase 2, a diretoria aprovou a continuidade e perguntou: </w:t>
       </w:r>
       <w:r>
         <w:rPr>
@@ -1014,14 +1113,16 @@
         </w:rPr>
         <w:t>como os agentes vão interagir com usuários, dados e processos para gerar valor real?</w:t>
       </w:r>
-      <w:r>
-        <w:t xml:space="preserve"> A resposta parte de uma constatação: os problemas de experiência, reputação e recorrência </w:t>
+    </w:p>
+    <w:p>
+      <w:r>
+        <w:t xml:space="preserve">A resposta parte de uma constatação: esses problemas nascem no mesmo lugar, </w:t>
       </w:r>
       <w:r>
         <w:rPr>
           <w:b/>
         </w:rPr>
-        <w:t>nascem no mesmo lugar, a jornada do pedido</w:t>
+        <w:t>a jornada do pedido</w:t>
       </w:r>
       <w:r>
         <w:t xml:space="preserve">. Quando o pedido atrasa, </w:t>
@@ -1033,7 +1134,7 @@
         <w:t>54%</w:t>
       </w:r>
       <w:r>
-        <w:t xml:space="preserve"> dos clientes dão nota 1 ou 2 (contra 9% no prazo). </w:t>
+        <w:t xml:space="preserve"> dos clientes dão nota 1 ou 2 (contra 9% no prazo); </w:t>
       </w:r>
       <w:r>
         <w:rPr>
@@ -1042,761 +1143,59 @@
         <w:t>27%</w:t>
       </w:r>
       <w:r>
-        <w:t xml:space="preserve"> dos atrasos começam antes da transportadora, com o seller postando depois do limite. E quem teve a 1ª compra atrasada volta menos (1,56% contra 2,13%).</w:t>
-      </w:r>
-    </w:p>
-    <w:p>
-      <w:r>
-        <w:t xml:space="preserve">Por isso, </w:t>
+        <w:t xml:space="preserve"> dos atrasos começam antes da transportadora, com o seller postando depois do limite; e quem teve a 1ª compra atrasada volta menos (1,56% contra 2,13%). Por isso, </w:t>
       </w:r>
       <w:r>
         <w:rPr>
           <w:b/>
         </w:rPr>
-        <w:t>dos seis agentes propostos na Fase 1, três foram priorizados e detalhados</w:t>
-      </w:r>
-      <w:r>
-        <w:t>. Eles atuam em sequência na jornada do pedido:</w:t>
-      </w:r>
-    </w:p>
-    <w:tbl>
-      <w:tblPr>
-        <w:tblW w:type="auto" w:w="0"/>
-        <w:jc w:val="center"/>
-        <w:tblLook w:firstColumn="1" w:firstRow="1" w:lastColumn="0" w:lastRow="0" w:noHBand="0" w:noVBand="1" w:val="04A0"/>
-        <w:tblBorders>
-          <w:top w:val="single" w:sz="4" w:color="C9CED6"/>
-          <w:left w:val="single" w:sz="4" w:color="C9CED6"/>
-          <w:bottom w:val="single" w:sz="4" w:color="C9CED6"/>
-          <w:right w:val="single" w:sz="4" w:color="C9CED6"/>
-          <w:insideH w:val="single" w:sz="4" w:color="C9CED6"/>
-          <w:insideV w:val="single" w:sz="4" w:color="C9CED6"/>
-        </w:tblBorders>
-        <w:tblCellMar>
-          <w:top w:w="68" w:type="dxa"/>
-          <w:bottom w:w="68" w:type="dxa"/>
-          <w:left w:w="68" w:type="dxa"/>
-          <w:right w:w="68" w:type="dxa"/>
-        </w:tblCellMar>
-      </w:tblPr>
-      <w:tblGrid>
-        <w:gridCol w:w="2040"/>
-        <w:gridCol w:w="2040"/>
-        <w:gridCol w:w="2040"/>
-        <w:gridCol w:w="2040"/>
-        <w:gridCol w:w="2040"/>
-      </w:tblGrid>
-      <w:tr>
-        <w:trPr>
-          <w:tblHeader w:val="true"/>
-          <w:cantSplit w:val="true"/>
-        </w:trPr>
-        <w:tc>
-          <w:tcPr>
-            <w:tcW w:type="dxa" w:w="1041"/>
-            <w:shd w:val="clear" w:color="auto" w:fill="E8EEF7"/>
-          </w:tcPr>
-          <w:p>
-            <w:pPr>
-              <w:spacing w:after="0" w:line="240" w:lineRule="auto"/>
-            </w:pPr>
-            <w:r/>
-            <w:r>
-              <w:rPr>
-                <w:b/>
-                <w:color w:val="1F3A5F"/>
-                <w:sz w:val="15"/>
-              </w:rPr>
-              <w:t>Desafio (Fase 1)</w:t>
-            </w:r>
-          </w:p>
-        </w:tc>
-        <w:tc>
-          <w:tcPr>
-            <w:tcW w:type="dxa" w:w="2602"/>
-            <w:shd w:val="clear" w:color="auto" w:fill="E8EEF7"/>
-          </w:tcPr>
-          <w:p>
-            <w:pPr>
-              <w:spacing w:after="0" w:line="240" w:lineRule="auto"/>
-            </w:pPr>
-            <w:r/>
-            <w:r>
-              <w:rPr>
-                <w:b/>
-                <w:color w:val="1F3A5F"/>
-                <w:sz w:val="15"/>
-              </w:rPr>
-              <w:t>Evidência</w:t>
-            </w:r>
-          </w:p>
-        </w:tc>
-        <w:tc>
-          <w:tcPr>
-            <w:tcW w:type="dxa" w:w="2446"/>
-            <w:shd w:val="clear" w:color="auto" w:fill="E8EEF7"/>
-          </w:tcPr>
-          <w:p>
-            <w:pPr>
-              <w:spacing w:after="0" w:line="240" w:lineRule="auto"/>
-            </w:pPr>
-            <w:r/>
-            <w:r>
-              <w:rPr>
-                <w:b/>
-                <w:color w:val="1F3A5F"/>
-                <w:sz w:val="15"/>
-              </w:rPr>
-              <w:t>Agente</w:t>
-            </w:r>
-          </w:p>
-        </w:tc>
-        <w:tc>
-          <w:tcPr>
-            <w:tcW w:type="dxa" w:w="2914"/>
-            <w:shd w:val="clear" w:color="auto" w:fill="E8EEF7"/>
-          </w:tcPr>
-          <w:p>
-            <w:pPr>
-              <w:spacing w:after="0" w:line="240" w:lineRule="auto"/>
-            </w:pPr>
-            <w:r/>
-            <w:r>
-              <w:rPr>
-                <w:b/>
-                <w:color w:val="1F3A5F"/>
-                <w:sz w:val="15"/>
-              </w:rPr>
-              <w:t>Situação na Fase 2</w:t>
-            </w:r>
-          </w:p>
-        </w:tc>
-        <w:tc>
-          <w:tcPr>
-            <w:tcW w:type="dxa" w:w="1197"/>
-            <w:shd w:val="clear" w:color="auto" w:fill="E8EEF7"/>
-          </w:tcPr>
-          <w:p>
-            <w:pPr>
-              <w:spacing w:after="0" w:line="240" w:lineRule="auto"/>
-            </w:pPr>
-            <w:r/>
-            <w:r>
-              <w:rPr>
-                <w:b/>
-                <w:color w:val="1F3A5F"/>
-                <w:sz w:val="15"/>
-              </w:rPr>
-              <w:t>KPI principal</w:t>
-            </w:r>
-          </w:p>
-        </w:tc>
-      </w:tr>
-      <w:tr>
-        <w:trPr>
-          <w:cantSplit w:val="true"/>
-        </w:trPr>
-        <w:tc>
-          <w:tcPr>
-            <w:tcW w:type="dxa" w:w="1041"/>
-          </w:tcPr>
-          <w:p>
-            <w:pPr>
-              <w:spacing w:after="0" w:line="240" w:lineRule="auto"/>
-            </w:pPr>
-            <w:r/>
-            <w:r>
-              <w:rPr>
-                <w:sz w:val="15"/>
-              </w:rPr>
-              <w:t>Atrasos logísticos</w:t>
-            </w:r>
-          </w:p>
-        </w:tc>
-        <w:tc>
-          <w:tcPr>
-            <w:tcW w:type="dxa" w:w="2602"/>
-          </w:tcPr>
-          <w:p>
-            <w:pPr>
-              <w:spacing w:after="0" w:line="240" w:lineRule="auto"/>
-            </w:pPr>
-            <w:r/>
-            <w:r>
-              <w:rPr>
-                <w:sz w:val="15"/>
-              </w:rPr>
-              <w:t>8,11%; 27% começam na postagem</w:t>
-            </w:r>
-          </w:p>
-        </w:tc>
-        <w:tc>
-          <w:tcPr>
-            <w:tcW w:type="dxa" w:w="2446"/>
-          </w:tcPr>
-          <w:p>
-            <w:pPr>
-              <w:spacing w:after="0" w:line="240" w:lineRule="auto"/>
-            </w:pPr>
-            <w:r/>
-            <w:r>
-              <w:rPr>
-                <w:b/>
-                <w:sz w:val="15"/>
-              </w:rPr>
-              <w:t>LogiPredict</w:t>
-            </w:r>
-            <w:r>
-              <w:rPr>
-                <w:sz w:val="15"/>
-              </w:rPr>
-              <w:t xml:space="preserve"> · Guardião do Prazo</w:t>
-            </w:r>
-          </w:p>
-        </w:tc>
-        <w:tc>
-          <w:tcPr>
-            <w:tcW w:type="dxa" w:w="2914"/>
-          </w:tcPr>
-          <w:p>
-            <w:pPr>
-              <w:spacing w:after="0" w:line="240" w:lineRule="auto"/>
-            </w:pPr>
-            <w:r/>
-            <w:r>
-              <w:rPr>
-                <w:b/>
-                <w:sz w:val="15"/>
-              </w:rPr>
-              <w:t>Detalhado</w:t>
-            </w:r>
-          </w:p>
-        </w:tc>
-        <w:tc>
-          <w:tcPr>
-            <w:tcW w:type="dxa" w:w="1197"/>
-          </w:tcPr>
-          <w:p>
-            <w:pPr>
-              <w:spacing w:after="0" w:line="240" w:lineRule="auto"/>
-            </w:pPr>
-            <w:r/>
-            <w:r>
-              <w:rPr>
-                <w:sz w:val="15"/>
-              </w:rPr>
-              <w:t>Taxa de atraso</w:t>
-            </w:r>
-          </w:p>
-        </w:tc>
-      </w:tr>
-      <w:tr>
-        <w:trPr>
-          <w:cantSplit w:val="true"/>
-        </w:trPr>
-        <w:tc>
-          <w:tcPr>
-            <w:tcW w:type="dxa" w:w="1041"/>
-          </w:tcPr>
-          <w:p>
-            <w:pPr>
-              <w:spacing w:after="0" w:line="240" w:lineRule="auto"/>
-            </w:pPr>
-            <w:r/>
-            <w:r>
-              <w:rPr>
-                <w:sz w:val="15"/>
-              </w:rPr>
-              <w:t>Insatisfação</w:t>
-            </w:r>
-          </w:p>
-        </w:tc>
-        <w:tc>
-          <w:tcPr>
-            <w:tcW w:type="dxa" w:w="2602"/>
-          </w:tcPr>
-          <w:p>
-            <w:pPr>
-              <w:spacing w:after="0" w:line="240" w:lineRule="auto"/>
-            </w:pPr>
-            <w:r/>
-            <w:r>
-              <w:rPr>
-                <w:sz w:val="15"/>
-              </w:rPr>
-              <w:t>14,7% notas 1–2; 47% falam de entrega</w:t>
-            </w:r>
-          </w:p>
-        </w:tc>
-        <w:tc>
-          <w:tcPr>
-            <w:tcW w:type="dxa" w:w="2446"/>
-          </w:tcPr>
-          <w:p>
-            <w:pPr>
-              <w:spacing w:after="0" w:line="240" w:lineRule="auto"/>
-            </w:pPr>
-            <w:r/>
-            <w:r>
-              <w:rPr>
-                <w:b/>
-                <w:sz w:val="15"/>
-              </w:rPr>
-              <w:t>SentimentDesk</w:t>
-            </w:r>
-            <w:r>
-              <w:rPr>
-                <w:sz w:val="15"/>
-              </w:rPr>
-              <w:t xml:space="preserve"> · Triagem de Avaliações Negativas</w:t>
-            </w:r>
-          </w:p>
-        </w:tc>
-        <w:tc>
-          <w:tcPr>
-            <w:tcW w:type="dxa" w:w="2914"/>
-          </w:tcPr>
-          <w:p>
-            <w:pPr>
-              <w:spacing w:after="0" w:line="240" w:lineRule="auto"/>
-            </w:pPr>
-            <w:r/>
-            <w:r>
-              <w:rPr>
-                <w:b/>
-                <w:sz w:val="15"/>
-              </w:rPr>
-              <w:t>Detalhado</w:t>
-            </w:r>
-          </w:p>
-        </w:tc>
-        <w:tc>
-          <w:tcPr>
-            <w:tcW w:type="dxa" w:w="1197"/>
-          </w:tcPr>
-          <w:p>
-            <w:pPr>
-              <w:spacing w:after="0" w:line="240" w:lineRule="auto"/>
-            </w:pPr>
-            <w:r/>
-            <w:r>
-              <w:rPr>
-                <w:sz w:val="15"/>
-              </w:rPr>
-              <w:t>Tempo até a 1ª resposta</w:t>
-            </w:r>
-          </w:p>
-        </w:tc>
-      </w:tr>
-      <w:tr>
-        <w:trPr>
-          <w:cantSplit w:val="true"/>
-        </w:trPr>
-        <w:tc>
-          <w:tcPr>
-            <w:tcW w:type="dxa" w:w="1041"/>
-          </w:tcPr>
-          <w:p>
-            <w:pPr>
-              <w:spacing w:after="0" w:line="240" w:lineRule="auto"/>
-            </w:pPr>
-            <w:r/>
-            <w:r>
-              <w:rPr>
-                <w:sz w:val="15"/>
-              </w:rPr>
-              <w:t>Baixa recorrência</w:t>
-            </w:r>
-          </w:p>
-        </w:tc>
-        <w:tc>
-          <w:tcPr>
-            <w:tcW w:type="dxa" w:w="2602"/>
-          </w:tcPr>
-          <w:p>
-            <w:pPr>
-              <w:spacing w:after="0" w:line="240" w:lineRule="auto"/>
-            </w:pPr>
-            <w:r/>
-            <w:r>
-              <w:rPr>
-                <w:sz w:val="15"/>
-              </w:rPr>
-              <w:t>Recompra 3,00%; 54% das 2ªs compras em até 90 dias</w:t>
-            </w:r>
-          </w:p>
-        </w:tc>
-        <w:tc>
-          <w:tcPr>
-            <w:tcW w:type="dxa" w:w="2446"/>
-          </w:tcPr>
-          <w:p>
-            <w:pPr>
-              <w:spacing w:after="0" w:line="240" w:lineRule="auto"/>
-            </w:pPr>
-            <w:r/>
-            <w:r>
-              <w:rPr>
-                <w:b/>
-                <w:sz w:val="15"/>
-              </w:rPr>
-              <w:t>WinBack</w:t>
-            </w:r>
-            <w:r>
-              <w:rPr>
-                <w:sz w:val="15"/>
-              </w:rPr>
-              <w:t xml:space="preserve"> · Segunda Compra</w:t>
-            </w:r>
-          </w:p>
-        </w:tc>
-        <w:tc>
-          <w:tcPr>
-            <w:tcW w:type="dxa" w:w="2914"/>
-          </w:tcPr>
-          <w:p>
-            <w:pPr>
-              <w:spacing w:after="0" w:line="240" w:lineRule="auto"/>
-            </w:pPr>
-            <w:r/>
-            <w:r>
-              <w:rPr>
-                <w:b/>
-                <w:sz w:val="15"/>
-              </w:rPr>
-              <w:t>Detalhado</w:t>
-            </w:r>
-            <w:r>
-              <w:rPr>
-                <w:sz w:val="15"/>
-              </w:rPr>
-              <w:t xml:space="preserve"> (reposicionado)</w:t>
-            </w:r>
-          </w:p>
-        </w:tc>
-        <w:tc>
-          <w:tcPr>
-            <w:tcW w:type="dxa" w:w="1197"/>
-          </w:tcPr>
-          <w:p>
-            <w:pPr>
-              <w:spacing w:after="0" w:line="240" w:lineRule="auto"/>
-            </w:pPr>
-            <w:r/>
-            <w:r>
-              <w:rPr>
-                <w:sz w:val="15"/>
-              </w:rPr>
-              <w:t>Conversão em 2ª compra</w:t>
-            </w:r>
-          </w:p>
-        </w:tc>
-      </w:tr>
-      <w:tr>
-        <w:trPr>
-          <w:cantSplit w:val="true"/>
-        </w:trPr>
-        <w:tc>
-          <w:tcPr>
-            <w:tcW w:type="dxa" w:w="1041"/>
-          </w:tcPr>
-          <w:p>
-            <w:pPr>
-              <w:spacing w:after="0" w:line="240" w:lineRule="auto"/>
-            </w:pPr>
-            <w:r/>
-            <w:r>
-              <w:rPr>
-                <w:sz w:val="15"/>
-              </w:rPr>
-              <w:t>Qualidade de sellers</w:t>
-            </w:r>
-          </w:p>
-        </w:tc>
-        <w:tc>
-          <w:tcPr>
-            <w:tcW w:type="dxa" w:w="2602"/>
-          </w:tcPr>
-          <w:p>
-            <w:pPr>
-              <w:spacing w:after="0" w:line="240" w:lineRule="auto"/>
-            </w:pPr>
-            <w:r/>
-            <w:r>
-              <w:rPr>
-                <w:sz w:val="15"/>
-              </w:rPr>
-              <w:t>527 no cluster problemático</w:t>
-            </w:r>
-          </w:p>
-        </w:tc>
-        <w:tc>
-          <w:tcPr>
-            <w:tcW w:type="dxa" w:w="2446"/>
-          </w:tcPr>
-          <w:p>
-            <w:pPr>
-              <w:spacing w:after="0" w:line="240" w:lineRule="auto"/>
-            </w:pPr>
-            <w:r/>
-            <w:r>
-              <w:rPr>
-                <w:sz w:val="15"/>
-              </w:rPr>
-              <w:t>SellerCare</w:t>
-            </w:r>
-          </w:p>
-        </w:tc>
-        <w:tc>
-          <w:tcPr>
-            <w:tcW w:type="dxa" w:w="2914"/>
-          </w:tcPr>
-          <w:p>
-            <w:pPr>
-              <w:spacing w:after="0" w:line="240" w:lineRule="auto"/>
-            </w:pPr>
-            <w:r/>
-            <w:r>
-              <w:rPr>
-                <w:sz w:val="15"/>
-              </w:rPr>
-              <w:t>Ações absorvidas por LogiPredict e SentimentDesk; Wave 3</w:t>
-            </w:r>
-          </w:p>
-        </w:tc>
-        <w:tc>
-          <w:tcPr>
-            <w:tcW w:type="dxa" w:w="1197"/>
-          </w:tcPr>
-          <w:p>
-            <w:pPr>
-              <w:spacing w:after="0" w:line="240" w:lineRule="auto"/>
-            </w:pPr>
-            <w:r/>
-            <w:r>
-              <w:rPr>
-                <w:sz w:val="15"/>
-              </w:rPr>
-              <w:t>Nota / SLA</w:t>
-            </w:r>
-          </w:p>
-        </w:tc>
-      </w:tr>
-      <w:tr>
-        <w:trPr>
-          <w:cantSplit w:val="true"/>
-        </w:trPr>
-        <w:tc>
-          <w:tcPr>
-            <w:tcW w:type="dxa" w:w="1041"/>
-          </w:tcPr>
-          <w:p>
-            <w:pPr>
-              <w:spacing w:after="0" w:line="240" w:lineRule="auto"/>
-            </w:pPr>
-            <w:r/>
-            <w:r>
-              <w:rPr>
-                <w:sz w:val="15"/>
-              </w:rPr>
-              <w:t>Peso do frete</w:t>
-            </w:r>
-          </w:p>
-        </w:tc>
-        <w:tc>
-          <w:tcPr>
-            <w:tcW w:type="dxa" w:w="2602"/>
-          </w:tcPr>
-          <w:p>
-            <w:pPr>
-              <w:spacing w:after="0" w:line="240" w:lineRule="auto"/>
-            </w:pPr>
-            <w:r/>
-            <w:r>
-              <w:rPr>
-                <w:sz w:val="15"/>
-              </w:rPr>
-              <w:t>21,34% do pedido</w:t>
-            </w:r>
-          </w:p>
-        </w:tc>
-        <w:tc>
-          <w:tcPr>
-            <w:tcW w:type="dxa" w:w="2446"/>
-          </w:tcPr>
-          <w:p>
-            <w:pPr>
-              <w:spacing w:after="0" w:line="240" w:lineRule="auto"/>
-            </w:pPr>
-            <w:r/>
-            <w:r>
-              <w:rPr>
-                <w:sz w:val="15"/>
-              </w:rPr>
-              <w:t>SmartFreight</w:t>
-            </w:r>
-          </w:p>
-        </w:tc>
-        <w:tc>
-          <w:tcPr>
-            <w:tcW w:type="dxa" w:w="2914"/>
-          </w:tcPr>
-          <w:p>
-            <w:pPr>
-              <w:spacing w:after="0" w:line="240" w:lineRule="auto"/>
-            </w:pPr>
-            <w:r/>
-            <w:r>
-              <w:rPr>
-                <w:sz w:val="15"/>
-              </w:rPr>
-              <w:t>Backlog (falta dado de concorrência)</w:t>
-            </w:r>
-          </w:p>
-        </w:tc>
-        <w:tc>
-          <w:tcPr>
-            <w:tcW w:type="dxa" w:w="1197"/>
-          </w:tcPr>
-          <w:p>
-            <w:pPr>
-              <w:spacing w:after="0" w:line="240" w:lineRule="auto"/>
-            </w:pPr>
-            <w:r/>
-            <w:r>
-              <w:rPr>
-                <w:sz w:val="15"/>
-              </w:rPr>
-              <w:t>Frete / conversão</w:t>
-            </w:r>
-          </w:p>
-        </w:tc>
-      </w:tr>
-      <w:tr>
-        <w:trPr>
-          <w:cantSplit w:val="true"/>
-        </w:trPr>
-        <w:tc>
-          <w:tcPr>
-            <w:tcW w:type="dxa" w:w="1041"/>
-          </w:tcPr>
-          <w:p>
-            <w:pPr>
-              <w:spacing w:after="0" w:line="240" w:lineRule="auto"/>
-            </w:pPr>
-            <w:r/>
-            <w:r>
-              <w:rPr>
-                <w:sz w:val="15"/>
-              </w:rPr>
-              <w:t>Decisão fragmentada</w:t>
-            </w:r>
-          </w:p>
-        </w:tc>
-        <w:tc>
-          <w:tcPr>
-            <w:tcW w:type="dxa" w:w="2602"/>
-          </w:tcPr>
-          <w:p>
-            <w:pPr>
-              <w:spacing w:after="0" w:line="240" w:lineRule="auto"/>
-            </w:pPr>
-            <w:r/>
-            <w:r>
-              <w:rPr>
-                <w:sz w:val="15"/>
-              </w:rPr>
-              <w:t>Sinais dispersos</w:t>
-            </w:r>
-          </w:p>
-        </w:tc>
-        <w:tc>
-          <w:tcPr>
-            <w:tcW w:type="dxa" w:w="2446"/>
-          </w:tcPr>
-          <w:p>
-            <w:pPr>
-              <w:spacing w:after="0" w:line="240" w:lineRule="auto"/>
-            </w:pPr>
-            <w:r/>
-            <w:r>
-              <w:rPr>
-                <w:sz w:val="15"/>
-              </w:rPr>
-              <w:t>Maestro</w:t>
-            </w:r>
-          </w:p>
-        </w:tc>
-        <w:tc>
-          <w:tcPr>
-            <w:tcW w:type="dxa" w:w="2914"/>
-          </w:tcPr>
-          <w:p>
-            <w:pPr>
-              <w:spacing w:after="0" w:line="240" w:lineRule="auto"/>
-            </w:pPr>
-            <w:r/>
-            <w:r>
-              <w:rPr>
-                <w:sz w:val="15"/>
-              </w:rPr>
-              <w:t>Orquestração na Fase 4</w:t>
-            </w:r>
-          </w:p>
-        </w:tc>
-        <w:tc>
-          <w:tcPr>
-            <w:tcW w:type="dxa" w:w="1197"/>
-          </w:tcPr>
-          <w:p>
-            <w:pPr>
-              <w:spacing w:after="0" w:line="240" w:lineRule="auto"/>
-            </w:pPr>
-            <w:r/>
-            <w:r>
-              <w:rPr>
-                <w:sz w:val="15"/>
-              </w:rPr>
-              <w:t>Tempo para decisão</w:t>
-            </w:r>
-          </w:p>
-        </w:tc>
-      </w:tr>
-    </w:tbl>
-    <w:p>
-      <w:pPr>
-        <w:spacing w:after="40"/>
-      </w:pPr>
+        <w:t>dos seis agentes da Fase 1, priorizamos três que atuam em sequência nessa jornada</w:t>
+      </w:r>
+      <w:r>
+        <w:t xml:space="preserve"> — LogiPredict (Guardião do Prazo), SentimentDesk (Triagem de Avaliações Negativas) e WinBack (Segunda Compra) —, cada um com um objetivo único, gatilhos definidos e uma lista fechada de ações. O SellerCare foi absorvido pelos dois primeiros, o SmartFreight segue no backlog e o Maestro orquestra a partir da Fase 4 (priorização completa na Seção 5.3).</w:t>
+      </w:r>
     </w:p>
     <w:p>
       <w:r>
         <w:rPr>
           <w:b/>
         </w:rPr>
-        <w:t>Valor esperado no cenário base (12 meses, escala do dataset):</w:t>
-      </w:r>
-      <w:r>
-        <w:t xml:space="preserve"> 672 atrasos evitados e 302 avaliações 1–2 a menos (LogiPredict); 1.230 horas de triagem poupadas, ou R$ 55 mil (SentimentDesk); 358 segundas compras adicionais, ou R$ 53 mil de receita (WinBack). O cálculo completo, com cada número de entrada e premissa, está na Seção 13.4.</w:t>
-      </w:r>
-    </w:p>
-    <w:p>
+        <w:t>Potencial estimado, não resultado observado:</w:t>
+      </w:r>
+      <w:r>
+        <w:t xml:space="preserve"> em um horizonte anual e na escala da amostra histórica do dataset, o cenário base dos </w:t>
+      </w:r>
       <w:r>
         <w:rPr>
           <w:b/>
         </w:rPr>
-        <w:t>Recomendação:</w:t>
-      </w:r>
-      <w:r>
-        <w:t xml:space="preserve"> aprovar um </w:t>
+        <w:t>dois agentes do piloto</w:t>
+      </w:r>
+      <w:r>
+        <w:t xml:space="preserve"> corresponde a 672 atrasos evitados, 302 avaliações negativas a menos e 1.230 horas de triagem poupadas (equivalentes a aproximadamente R$ 55 mil de capacidade operacional). </w:t>
       </w:r>
       <w:r>
         <w:rPr>
           <w:b/>
         </w:rPr>
-        <w:t>piloto de 90 dias da Wave 1 (LogiPredict + SentimentDesk)</w:t>
-      </w:r>
-      <w:r>
-        <w:t>, com grupo controle. O WinBack entra na Wave 2.</w:t>
+        <w:t>Separadamente, na expansão futura</w:t>
+      </w:r>
+      <w:r>
+        <w:t>, o WinBack tem potencial estimado de 358 segundas compras adicionais (aproximadamente R$ 53 mil de receita bruta incremental). Nenhum desses valores representa meta de entrega integral nos 90 dias, economia de caixa comprovada ou retorno líquido. Premissas e contas: Seção 13.4.</w:t>
+      </w:r>
+    </w:p>
+    <w:p>
+      <w:r>
+        <w:t xml:space="preserve">A aprovação do piloto fica condicionada à definição do volume elegível, desenho dos grupos comparáveis, acesso aos dados e canais, responsáveis pelas intervenções e orçamento de execução. A visão de seis agentes orquestrados pelo Maestro, proposta na Fase 1, continua sendo o destino. A Fase 2 dá a ela um primeiro passo concreto, com ordem e critério: </w:t>
+      </w:r>
+      <w:r>
+        <w:rPr>
+          <w:b/>
+        </w:rPr>
+        <w:t>não propomos mais agentes, propomos agentes melhores</w:t>
+      </w:r>
+      <w:r>
+        <w:t>, começando pela origem do problema — e cada onda seguinte só avança com resultado medido na anterior (roadmap completo na Seção 12).</w:t>
       </w:r>
     </w:p>
     <w:tbl>
@@ -1873,6 +1272,18 @@
               </w:r>
             </w:hyperlink>
           </w:p>
+          <w:p>
+            <w:pPr>
+              <w:spacing w:after="60" w:line="240" w:lineRule="auto"/>
+            </w:pPr>
+            <w:r>
+              <w:rPr>
+                <w:i/>
+                <w:sz w:val="19"/>
+              </w:rPr>
+              <w:t>As metas apresentadas são hipóteses de impacto para validação em piloto, não resultados comprovados pelo dataset histórico.</w:t>
+            </w:r>
+          </w:p>
         </w:tc>
       </w:tr>
     </w:tbl>
@@ -1880,11 +1291,6 @@
       <w:pPr>
         <w:spacing w:after="40"/>
       </w:pPr>
-    </w:p>
-    <w:p>
-      <w:r>
-        <w:t>As metas apresentadas são hipóteses de impacto para validação em piloto, não resultados comprovados pelo dataset histórico.</w:t>
-      </w:r>
     </w:p>
     <w:p>
       <w:r>
@@ -2639,7 +2045,56 @@
         <w:pStyle w:val="Heading2"/>
       </w:pPr>
       <w:r>
-        <w:t>3.2 Limitações do diagnóstico</w:t>
+        <w:t>3.2 Evidência, premissa e validação (novo na revisão executiva)</w:t>
+      </w:r>
+    </w:p>
+    <w:p>
+      <w:r>
+        <w:t xml:space="preserve">Para evitar confusão entre diagnóstico e resultado futuro, este relatório adota três classificações: </w:t>
+      </w:r>
+      <w:r>
+        <w:rPr>
+          <w:b/>
+        </w:rPr>
+        <w:t>(i) observado</w:t>
+      </w:r>
+      <w:r>
+        <w:t xml:space="preserve"> = calculado no dataset histórico; </w:t>
+      </w:r>
+      <w:r>
+        <w:rPr>
+          <w:b/>
+        </w:rPr>
+        <w:t>(ii) premissa</w:t>
+      </w:r>
+      <w:r>
+        <w:t xml:space="preserve"> = parâmetro definido pelo grupo, ainda não comprovado; </w:t>
+      </w:r>
+      <w:r>
+        <w:rPr>
+          <w:b/>
+        </w:rPr>
+        <w:t>(iii) projeção</w:t>
+      </w:r>
+      <w:r>
+        <w:t xml:space="preserve"> = resultado aritmético que combina observações e premissas. Exemplos: 8,11% de atraso é observado; eliminar 50% da diferença entre grupos é premissa; 672 atrasos evitados é projeção. </w:t>
+      </w:r>
+      <w:r>
+        <w:rPr>
+          <w:b/>
+        </w:rPr>
+        <w:t>Não se infere causalidade nem desempenho de produção a partir da associação histórica.</w:t>
+      </w:r>
+      <w:r>
+        <w:t xml:space="preserve"> O piloto deverá medir impacto incremental frente a controle comparável.</w:t>
+      </w:r>
+    </w:p>
+    <w:p>
+      <w:pPr>
+        <w:pStyle w:val="Heading2"/>
+      </w:pPr>
+      <w:r>
+        <w:t>3.3 Limitações do diagnóstico</w:t>
       </w:r>
     </w:p>
     <w:p>
@@ -2685,11 +2140,6 @@
       </w:pPr>
       <w:r>
         <w:t>Metas de impacto são hipóteses a testar em pilotos controlados.</w:t>
-      </w:r>
-    </w:p>
-    <w:p>
-      <w:r>
-        <w:br w:type="page"/>
       </w:r>
     </w:p>
     <w:p>
@@ -4984,6 +4434,57 @@
       <w:pPr>
         <w:spacing w:after="40"/>
       </w:pPr>
+    </w:p>
+    <w:p>
+      <w:pPr>
+        <w:pStyle w:val="Heading2"/>
+      </w:pPr>
+      <w:r>
+        <w:t>5.2.1 Por que iniciar no Nordeste? (novo na revisão executiva)</w:t>
+      </w:r>
+    </w:p>
+    <w:p>
+      <w:r>
+        <w:t xml:space="preserve">AL (23,9%), MA (19,7%) e PI (16,0%) apresentam taxas históricas de atraso acima da média do dataset (8,11%), justificando a </w:t>
+      </w:r>
+      <w:r>
+        <w:rPr>
+          <w:b/>
+        </w:rPr>
+        <w:t>hipótese de priorização</w:t>
+      </w:r>
+      <w:r>
+        <w:t xml:space="preserve"> das rotas da região. </w:t>
+      </w:r>
+      <w:r>
+        <w:rPr>
+          <w:b/>
+        </w:rPr>
+        <w:t>Isso não basta para comprovar que o Nordeste maximiza retorno ou é operacionalmente viável.</w:t>
+      </w:r>
+      <w:r>
+        <w:t xml:space="preserve"> Antes do piloto, a equipe deverá apurar: (1) volume de pedidos elegíveis por rota e seller; (2) concentração de atrasos evitáveis, especialmente na postagem; (3) disponibilidade e qualidade de rastreio e canais de contato; (4) capacidade de intervenção de Operações/CX; (5) custos por pedido e risco de contaminação entre grupos. As rotas definitivas devem ser selecionadas com esses critérios, não somente pelo percentual de atraso.</w:t>
+      </w:r>
+    </w:p>
+    <w:p>
+      <w:r>
+        <w:rPr>
+          <w:b/>
+        </w:rPr>
+        <w:t>Desenho de medição proposto:</w:t>
+      </w:r>
+      <w:r>
+        <w:t xml:space="preserve"> estabelecer baseline recente; alocar unidades comparáveis entre tratamento e controle (preferencialmente aleatorização por seller/rota, conforme risco de contaminação); definir previamente janela, métricas, exclusões e tamanho de amostra; comparar diferenças ajustadas por mix de rota, seller e sazonalidade. A forma final de alocação e o tamanho de amostra </w:t>
+      </w:r>
+      <w:r>
+        <w:rPr>
+          <w:b/>
+        </w:rPr>
+        <w:t>ainda dependem dos volumes reais</w:t>
+      </w:r>
+      <w:r>
+        <w:t>, não disponíveis no material fornecido.</w:t>
+      </w:r>
     </w:p>
     <w:p>
       <w:pPr>
@@ -6885,7 +6386,25 @@
         <w:t>SentimentDesk → LogiPredict:</w:t>
       </w:r>
       <w:r>
-        <w:t xml:space="preserve"> "motivo = entrega", que reforça o histórico de risco da rota e do seller.</w:t>
+        <w:t xml:space="preserve"> "motivo = entrega" como </w:t>
+      </w:r>
+      <w:r>
+        <w:rPr>
+          <w:b/>
+        </w:rPr>
+        <w:t>sinal histórico</w:t>
+      </w:r>
+      <w:r>
+        <w:t xml:space="preserve"> para análise de padrões de falha por rota e seller e eventual recalibração futura, </w:t>
+      </w:r>
+      <w:r>
+        <w:rPr>
+          <w:b/>
+        </w:rPr>
+        <w:t>não</w:t>
+      </w:r>
+      <w:r>
+        <w:t xml:space="preserve"> como intervenção retroativa em pedido já entregue.</w:t>
       </w:r>
     </w:p>
     <w:p>
@@ -8130,7 +7649,7 @@
               <w:rPr>
                 <w:sz w:val="17"/>
               </w:rPr>
-              <w:t>Aviso ao cliente com nova data (template aprovado)</w:t>
+              <w:t>Se projeção validada ultrapassar o prazo, comunicação ao cliente condicionada a política e template aprovados</w:t>
             </w:r>
           </w:p>
         </w:tc>
@@ -8188,7 +7707,16 @@
         <w:t>f) Indicadores impactados.</w:t>
       </w:r>
       <w:r>
-        <w:t xml:space="preserve"> Taxa de atraso (8,11%), postagens após o limite (9,0%), notas 1–2 em pedidos de risco, contatos "onde está meu pedido", falso positivo dos alertas.</w:t>
+        <w:t xml:space="preserve"> Taxa de atraso (8,11%), postagens após o limite (9,0%), notas 1–2 em pedidos de risco, contatos "onde está meu pedido", falso positivo dos alertas. </w:t>
+      </w:r>
+      <w:r>
+        <w:rPr>
+          <w:b/>
+        </w:rPr>
+        <w:t>Distinguir:</w:t>
+      </w:r>
+      <w:r>
+        <w:t xml:space="preserve"> qualidade preditiva (precisão/recall, falsos alertas, calibração por rota) e efeito da intervenção (redução incremental de atrasos frente ao controle). Um alerta correto não significa, necessariamente, atraso evitado.</w:t>
       </w:r>
     </w:p>
     <w:tbl>
@@ -8528,27 +8056,18 @@
         <w:rPr>
           <w:b/>
         </w:rPr>
-        <w:t>a) Objetivo.</w:t>
-      </w:r>
-      <w:r>
-        <w:t xml:space="preserve"> Responder rapidamente toda avaliação nota 1 a 3 e </w:t>
-      </w:r>
+        <w:t>a) Objetivo: interpretar e encaminhar.</w:t>
+      </w:r>
+      <w:r>
+        <w:t xml:space="preserve"> Classificar avaliações nota 1 a 3, priorizar o atendimento e preparar resposta e encaminhamento. O motivo descreve o relato; a causa e o responsável pela falha dependem de apuração.</w:t>
+      </w:r>
+    </w:p>
+    <w:p>
       <w:r>
         <w:rPr>
           <w:b/>
         </w:rPr>
-        <w:t>levar o problema a quem pode resolvê-lo</w:t>
-      </w:r>
-      <w:r>
-        <w:t>: transporte, seller ou atendimento.</w:t>
-      </w:r>
-    </w:p>
-    <w:p>
-      <w:r>
-        <w:rPr>
-          <w:b/>
-        </w:rPr>
-        <w:t>b) Problema resolvido.</w:t>
+        <w:t>b) Problema: reclamações sem triagem.</w:t>
       </w:r>
       <w:r>
         <w:t xml:space="preserve"> </w:t>
@@ -8578,7 +8097,7 @@
         <w:t>47%</w:t>
       </w:r>
       <w:r>
-        <w:t xml:space="preserve"> falam de entrega e </w:t>
+        <w:t xml:space="preserve"> dos comentários de notas 1–2 foram classificados por regras como entrega e </w:t>
       </w:r>
       <w:r>
         <w:rPr>
@@ -8595,7 +8114,7 @@
         <w:rPr>
           <w:b/>
         </w:rPr>
-        <w:t>c) Usuários envolvidos.</w:t>
+        <w:t>c) Usuários: cliente, CX e sellers.</w:t>
       </w:r>
       <w:r>
         <w:t xml:space="preserve"> Cliente (recebe resposta), Analista de CX (revisa casos críticos e define compensação), seller (recebe ticket), Gestor de CX (dashboard de motivos).</w:t>
@@ -8606,7 +8125,7 @@
         <w:rPr>
           <w:b/>
         </w:rPr>
-        <w:t>d) Dados utilizados.</w:t>
+        <w:t>d) Dados: contexto disponível na avaliação.</w:t>
       </w:r>
     </w:p>
     <w:tbl>
@@ -8756,7 +8275,7 @@
               <w:rPr>
                 <w:sz w:val="17"/>
               </w:rPr>
-              <w:t>Datas e status do pedido; atraso</w:t>
+              <w:t>Datas e status conhecidos no instante da avaliação; não usar entrega futura</w:t>
             </w:r>
           </w:p>
         </w:tc>
@@ -8825,7 +8344,7 @@
               <w:rPr>
                 <w:sz w:val="17"/>
               </w:rPr>
-              <w:t>Nº de itens e sellers no pedido, categoria</w:t>
+              <w:t>Nº de itens/sellers, categoria e vínculo item → seller, quando disponível</w:t>
             </w:r>
           </w:p>
         </w:tc>
@@ -8906,7 +8425,7 @@
               <w:rPr>
                 <w:sz w:val="17"/>
               </w:rPr>
-              <w:t>Sistema de tickets, histórico de contatos do cliente, canais públicos</w:t>
+              <w:t>Tickets, contatos, resolução confirmada, SLA aprovado e confirmação de execução; ausências são desconhecidas</w:t>
             </w:r>
           </w:p>
         </w:tc>
@@ -8922,7 +8441,7 @@
         <w:rPr>
           <w:b/>
         </w:rPr>
-        <w:t>e) Entradas e saídas.</w:t>
+        <w:t>e) Entradas e saídas: decisão antes da execução.</w:t>
       </w:r>
     </w:p>
     <w:tbl>
@@ -9095,7 +8614,7 @@
               <w:rPr>
                 <w:sz w:val="17"/>
               </w:rPr>
-              <w:t>Ticket ao seller; sinal ao LogiPredict (entrega) e ao WinBack (pausar)</w:t>
+              <w:t>Encaminhamento proposto à fila responsável; seller a confirmar se faltar vínculo com o item; pausa do WinBack para qualquer problema aberto</w:t>
             </w:r>
           </w:p>
         </w:tc>
@@ -9144,10 +8663,10 @@
         <w:rPr>
           <w:b/>
         </w:rPr>
-        <w:t>f) Indicadores impactados.</w:t>
-      </w:r>
-      <w:r>
-        <w:t xml:space="preserve"> Tempo até a 1ª resposta (a medir), detratores com caso resolvido, classificação correta em auditoria, reincidência por seller, nota média.</w:t>
+        <w:t>f) Indicadores: qualidade e tempo de atendimento.</w:t>
+      </w:r>
+      <w:r>
+        <w:t xml:space="preserve"> Tempo até a 1ª resposta (a medir), detratores com caso resolvido, classificação correta em auditoria, reincidência por seller e nota média. Medir também recall dos casos críticos, escalonamento indevido e respostas inadequadas: acurácia agregada pode esconder falhas graves.</w:t>
       </w:r>
     </w:p>
     <w:tbl>
@@ -9237,7 +8756,7 @@
               <w:rPr>
                 <w:sz w:val="17"/>
               </w:rPr>
-              <w:t>Classifica, resume, responde com template seguro, abre ticket, sinaliza outros agentes</w:t>
+              <w:t>Classifica e prepara rascunho; processo abre/atualiza ticket, confirma execução e só então envia resposta autorizada</w:t>
             </w:r>
           </w:p>
         </w:tc>
@@ -9469,6 +8988,45 @@
     </w:p>
     <w:p>
       <w:pPr>
+        <w:pStyle w:val="Heading3"/>
+      </w:pPr>
+      <w:r>
+        <w:t>Regras de revisão: incerteza, severidade e envio</w:t>
+      </w:r>
+    </w:p>
+    <w:p>
+      <w:r>
+        <w:t>Sem comentário, o motivo é OUTROS e o atraso é apenas uma hipótese, com revisão humana. Conflito de dados é CRÍTICO. Valor acima de R$ 500, valor ausente, contexto essencial ausente, responsável a confirmar ou confiança abaixo de 0,8 exigem revisão. A confiança é estimativa do modelo, ainda não calibrada. O roteamento define a fila que apura, não a culpa pela falha.</w:t>
+      </w:r>
+    </w:p>
+    <w:p>
+      <w:pPr>
+        <w:pStyle w:val="Heading3"/>
+      </w:pPr>
+      <w:r>
+        <w:t>Integração: problema aberto e resolução confirmada</w:t>
+      </w:r>
+    </w:p>
+    <w:p>
+      <w:r>
+        <w:t>Qualquer reclamação aberta, inclusive de produto, pausa ofertas do WinBack. Somente o atendimento confirma a resolução; esse evento libera uma nova avaliação de elegibilidade, sem oferta ou cupom automático. Motivo de entrega confirmado gera sinal ao LogiPredict.</w:t>
+      </w:r>
+    </w:p>
+    <w:p>
+      <w:pPr>
+        <w:pStyle w:val="Heading3"/>
+      </w:pPr>
+      <w:r>
+        <w:t>Limites: ações e prazos confirmados</w:t>
+      </w:r>
+    </w:p>
+    <w:p>
+      <w:r>
+        <w:t>O prompt isolado não abre tickets nem envia mensagens. Expressões como “já acionamos” dependem de retorno confirmado da ferramenta. Um SLA de dois dias úteis é hipótese de política de CX a aprovar, não dado do dataset; sem SLA fornecido, não informar prazo. O prazo, quando aprovado, é de retorno, não de solução. O processo deve registrar confirmação e impedir tickets/envios duplicados.</w:t>
+      </w:r>
+    </w:p>
+    <w:p>
+      <w:pPr>
         <w:pStyle w:val="Heading2"/>
       </w:pPr>
       <w:r>
@@ -9480,7 +9038,7 @@
         <w:rPr>
           <w:b/>
         </w:rPr>
-        <w:t>a) Objetivo.</w:t>
+        <w:t>a) Objetivo: favorecer a segunda compra.</w:t>
       </w:r>
       <w:r>
         <w:t xml:space="preserve"> Aumentar a conversão da </w:t>
@@ -9500,7 +9058,7 @@
         <w:rPr>
           <w:b/>
         </w:rPr>
-        <w:t>b) Problema resolvido.</w:t>
+        <w:t>b) Problema: baixa recorrência observada.</w:t>
       </w:r>
       <w:r>
         <w:t xml:space="preserve"> Só </w:t>
@@ -9530,7 +9088,7 @@
         <w:t>54%</w:t>
       </w:r>
       <w:r>
-        <w:t xml:space="preserve"> das segundas compras acontecem em até 90 dias. Hoje não há ação estruturada nessa janela. A consequência é custo de aquisição pago para uma única venda. </w:t>
+        <w:t xml:space="preserve"> das segundas compras acontecem em até 90 dias. A ausência de ação estruturada nessa janela é hipótese do case, não informação comprovada pelo dataset. A consequência é custo de aquisição pago para uma única venda. </w:t>
       </w:r>
       <w:r>
         <w:rPr>
@@ -9547,7 +9105,7 @@
         <w:rPr>
           <w:b/>
         </w:rPr>
-        <w:t>c) Usuários envolvidos.</w:t>
+        <w:t>c) Usuários: cliente e equipe de CRM.</w:t>
       </w:r>
       <w:r>
         <w:t xml:space="preserve"> Cliente (recebe mensagem), Analista de CRM (acompanha campanhas), Gestor de CRM (aprova incentivo acima do teto), Marketing (relatório de uplift).</w:t>
@@ -9558,7 +9116,7 @@
         <w:rPr>
           <w:b/>
         </w:rPr>
-        <w:t>d) Dados utilizados.</w:t>
+        <w:t>d) Dados: elegibilidade e contexto comercial.</w:t>
       </w:r>
     </w:p>
     <w:tbl>
@@ -9805,7 +9363,7 @@
               <w:rPr>
                 <w:sz w:val="17"/>
               </w:rPr>
-              <w:t>Nota e valor da 1ª compra</w:t>
+              <w:t>Nota e valor da 1ª compra; estado do problema e resolução vêm do atendimento</w:t>
             </w:r>
           </w:p>
         </w:tc>
@@ -9845,7 +9403,7 @@
               <w:rPr>
                 <w:sz w:val="17"/>
               </w:rPr>
-              <w:t>Opt-in (LGPD), histórico de contatos, catálogo e estoque, teto de incentivo</w:t>
+              <w:t>Opt-in/opt-out, último contato e contador, grupo persistente, catálogo elegível, orçamento e aprovação de incentivo</w:t>
             </w:r>
           </w:p>
         </w:tc>
@@ -9861,7 +9419,7 @@
         <w:rPr>
           <w:b/>
         </w:rPr>
-        <w:t>e) Entradas e saídas.</w:t>
+        <w:t>e) Entradas e saídas: pausa e reavaliação.</w:t>
       </w:r>
     </w:p>
     <w:tbl>
@@ -9895,7 +9453,7 @@
         </w:trPr>
         <w:tc>
           <w:tcPr>
-            <w:tcW w:type="dxa" w:w="3825"/>
+            <w:tcW w:type="dxa" w:w="3890"/>
             <w:shd w:val="clear" w:color="auto" w:fill="E8EEF7"/>
           </w:tcPr>
           <w:p>
@@ -9915,7 +9473,7 @@
         </w:tc>
         <w:tc>
           <w:tcPr>
-            <w:tcW w:type="dxa" w:w="6374"/>
+            <w:tcW w:type="dxa" w:w="6309"/>
             <w:shd w:val="clear" w:color="auto" w:fill="E8EEF7"/>
           </w:tcPr>
           <w:p>
@@ -9940,7 +9498,7 @@
         </w:trPr>
         <w:tc>
           <w:tcPr>
-            <w:tcW w:type="dxa" w:w="3825"/>
+            <w:tcW w:type="dxa" w:w="3890"/>
           </w:tcPr>
           <w:p>
             <w:pPr>
@@ -9957,7 +9515,7 @@
         </w:tc>
         <w:tc>
           <w:tcPr>
-            <w:tcW w:type="dxa" w:w="6374"/>
+            <w:tcW w:type="dxa" w:w="6309"/>
           </w:tcPr>
           <w:p>
             <w:pPr>
@@ -9979,7 +9537,7 @@
         </w:trPr>
         <w:tc>
           <w:tcPr>
-            <w:tcW w:type="dxa" w:w="3825"/>
+            <w:tcW w:type="dxa" w:w="3890"/>
           </w:tcPr>
           <w:p>
             <w:pPr>
@@ -9996,18 +9554,18 @@
         </w:tc>
         <w:tc>
           <w:tcPr>
-            <w:tcW w:type="dxa" w:w="6374"/>
-          </w:tcPr>
-          <w:p>
-            <w:pPr>
-              <w:spacing w:after="0" w:line="240" w:lineRule="auto"/>
-            </w:pPr>
-            <w:r/>
-            <w:r>
-              <w:rPr>
-                <w:sz w:val="17"/>
-              </w:rPr>
-              <w:t>Mensagem personalizada com até 2 categorias recomendadas</w:t>
+            <w:tcW w:type="dxa" w:w="6309"/>
+          </w:tcPr>
+          <w:p>
+            <w:pPr>
+              <w:spacing w:after="0" w:line="240" w:lineRule="auto"/>
+            </w:pPr>
+            <w:r/>
+            <w:r>
+              <w:rPr>
+                <w:sz w:val="17"/>
+              </w:rPr>
+              <w:t>PAUSAR: nenhuma oferta enquanto houver problema aberto</w:t>
             </w:r>
           </w:p>
         </w:tc>
@@ -10018,35 +9576,35 @@
         </w:trPr>
         <w:tc>
           <w:tcPr>
-            <w:tcW w:type="dxa" w:w="3825"/>
-          </w:tcPr>
-          <w:p>
-            <w:pPr>
-              <w:spacing w:after="0" w:line="240" w:lineRule="auto"/>
-            </w:pPr>
-            <w:r/>
-            <w:r>
-              <w:rPr>
-                <w:sz w:val="17"/>
-              </w:rPr>
-              <w:t>Ticket resolvido</w:t>
-            </w:r>
-          </w:p>
-        </w:tc>
-        <w:tc>
-          <w:tcPr>
-            <w:tcW w:type="dxa" w:w="6374"/>
-          </w:tcPr>
-          <w:p>
-            <w:pPr>
-              <w:spacing w:after="0" w:line="240" w:lineRule="auto"/>
-            </w:pPr>
-            <w:r/>
-            <w:r>
-              <w:rPr>
-                <w:sz w:val="17"/>
-              </w:rPr>
-              <w:t>Mensagem de desculpas com incentivo dentro do teto</w:t>
+            <w:tcW w:type="dxa" w:w="3890"/>
+          </w:tcPr>
+          <w:p>
+            <w:pPr>
+              <w:spacing w:after="0" w:line="240" w:lineRule="auto"/>
+            </w:pPr>
+            <w:r/>
+            <w:r>
+              <w:rPr>
+                <w:sz w:val="17"/>
+              </w:rPr>
+              <w:t>Resolução confirmada pelo atendimento</w:t>
+            </w:r>
+          </w:p>
+        </w:tc>
+        <w:tc>
+          <w:tcPr>
+            <w:tcW w:type="dxa" w:w="6309"/>
+          </w:tcPr>
+          <w:p>
+            <w:pPr>
+              <w:spacing w:after="0" w:line="240" w:lineRule="auto"/>
+            </w:pPr>
+            <w:r/>
+            <w:r>
+              <w:rPr>
+                <w:sz w:val="17"/>
+              </w:rPr>
+              <w:t>Reavaliar todos os bloqueios; sem oferta ou cupom automático</w:t>
             </w:r>
           </w:p>
         </w:tc>
@@ -10057,7 +9615,7 @@
         </w:trPr>
         <w:tc>
           <w:tcPr>
-            <w:tcW w:type="dxa" w:w="3825"/>
+            <w:tcW w:type="dxa" w:w="3890"/>
           </w:tcPr>
           <w:p>
             <w:pPr>
@@ -10074,7 +9632,7 @@
         </w:tc>
         <w:tc>
           <w:tcPr>
-            <w:tcW w:type="dxa" w:w="6374"/>
+            <w:tcW w:type="dxa" w:w="6309"/>
           </w:tcPr>
           <w:p>
             <w:pPr>
@@ -10101,10 +9659,10 @@
         <w:rPr>
           <w:b/>
         </w:rPr>
-        <w:t>f) Indicadores impactados.</w:t>
-      </w:r>
-      <w:r>
-        <w:t xml:space="preserve"> Conversão em 2ª compra em 90 dias (1,13%), recompra (3,0%), receita por cliente, uplift contra o controle, opt-out.</w:t>
+        <w:t>f) Indicadores: conversão e efeito incremental.</w:t>
+      </w:r>
+      <w:r>
+        <w:t xml:space="preserve"> Conversão em 2ª compra em 90 dias (1,13%), recompra (3,0%), receita por cliente, uplift contra o controle, opt-out e margem incremental após incentivos e custos de contato.</w:t>
       </w:r>
     </w:p>
     <w:tbl>
@@ -10194,7 +9752,7 @@
               <w:rPr>
                 <w:sz w:val="17"/>
               </w:rPr>
-              <w:t>Decide elegibilidade, momento, categoria e mensagem; separa o grupo controle</w:t>
+              <w:t>Processo verifica elegibilidade e separa controle antes da oferta; IA propõe categoria e rascunho</w:t>
             </w:r>
           </w:p>
         </w:tc>
@@ -10387,6 +9945,58 @@
     </w:p>
     <w:p>
       <w:pPr>
+        <w:pStyle w:val="Heading3"/>
+      </w:pPr>
+      <w:r>
+        <w:t>Regras de contato: verificações antes de cada envio</w:t>
+      </w:r>
+    </w:p>
+    <w:p>
+      <w:r>
+        <w:t>O processo verifica segunda compra, janela D+7–D+90, consentimento, opt-out, intervalo mínimo de 15 dias e máximo de dois contatos confirmados. Primeiro contato de D+7 em diante; segundo somente de D+45 em diante. Um dado essencial ausente bloqueia contato e pede verificação humana. A IA não sobrepõe esses bloqueios.</w:t>
+      </w:r>
+    </w:p>
+    <w:p>
+      <w:pPr>
+        <w:pStyle w:val="Heading3"/>
+      </w:pPr>
+      <w:r>
+        <w:t>Retomada: resolução não é autorização de campanha</w:t>
+      </w:r>
+    </w:p>
+    <w:p>
+      <w:r>
+        <w:t>Problema aberto pausa. Nota baixa/atraso sem resolução confirmada também pausa e pede verificação ao atendimento. Resolvido o problema e sem nova pendência, nota e atraso antigos não causam pausa permanente: o processo reavalia janela, segunda compra, consentimento e contatos. Compensação pertence ao atendimento; incentivo comercial só no segundo contato e com política, orçamento e margem disponíveis, conforme a política econômica da Seção 11.3. Acima de 10%, exige aprovação específica do gestor.</w:t>
+      </w:r>
+    </w:p>
+    <w:p>
+      <w:pPr>
+        <w:pStyle w:val="Heading3"/>
+      </w:pPr>
+      <w:r>
+        <w:t>Controle e medição: grupo fixo por cliente</w:t>
+      </w:r>
+    </w:p>
+    <w:p>
+      <w:r>
+        <w:t>O processo atribui 10% dos clientes elegíveis ao controle antes de gerar oferta e mantém o grupo até o fim do ciclo. Controle não recebe mensagens comerciais deste agente, mas recebe atendimento normal. O uplift compara conversão entre grupos com acompanhamento completo; não se calcula efeito causal com os dois exemplos. Segunda compra encerra o ciclo e envio duplicado é bloqueado.</w:t>
+      </w:r>
+    </w:p>
+    <w:p>
+      <w:pPr>
+        <w:pStyle w:val="Heading3"/>
+      </w:pPr>
+      <w:r>
+        <w:t>Limitação analítica: compra e entrega são marcos diferentes</w:t>
+      </w:r>
+    </w:p>
+    <w:p>
+      <w:r>
+        <w:t>Os 54% históricos usam dias entre compras; D+7–D+90 após a entrega é uma hipótese operacional a validar. O baseline de 1,13% precisa ser conferido com clientes que tiveram janela completa e marco temporal compatível (dependência de Caio/Jorge). Esta revisão não altera os cálculos nem as metas da Seção 13.</w:t>
+      </w:r>
+    </w:p>
+    <w:p>
+      <w:pPr>
         <w:pStyle w:val="Heading2"/>
       </w:pPr>
       <w:r>
@@ -10781,7 +10391,7 @@
       <w:r>
         <w:drawing>
           <wp:inline xmlns:a="http://schemas.openxmlformats.org/drawingml/2006/main" xmlns:pic="http://schemas.openxmlformats.org/drawingml/2006/picture">
-            <wp:extent cx="8460000" cy="3851821"/>
+            <wp:extent cx="8460000" cy="5246955"/>
             <wp:docPr id="7" name="Picture 7"/>
             <wp:cNvGraphicFramePr>
               <a:graphicFrameLocks noChangeAspect="1"/>
@@ -10802,7 +10412,7 @@
                   <pic:spPr>
                     <a:xfrm>
                       <a:off x="0" y="0"/>
-                      <a:ext cx="8460000" cy="3851821"/>
+                      <a:ext cx="8460000" cy="5246955"/>
                     </a:xfrm>
                     <a:prstGeom prst="rect"/>
                   </pic:spPr>
@@ -10834,7 +10444,7 @@
         <w:t>Decisões-chave:</w:t>
       </w:r>
       <w:r>
-        <w:t xml:space="preserve"> (1) a classificação é confiável? (2) o caso é crítico? (3) o motivo é entrega? </w:t>
+        <w:t xml:space="preserve"> (1) há contexto suficiente e revisão necessária? (2) o ticket foi confirmado? (3) existe problema aberto? </w:t>
       </w:r>
       <w:r>
         <w:rPr>
@@ -10843,7 +10453,7 @@
         <w:t>Humano no loop:</w:t>
       </w:r>
       <w:r>
-        <w:t xml:space="preserve"> classificação manual quando a confiança é baixa; revisão da resposta e compensação nos casos críticos.</w:t>
+        <w:t xml:space="preserve"> criticidade, confiança &lt; 0,8, valor &gt; R$ 500/ausente ou responsável incerto. O processo confirma ticket antes da mensagem, pausa ofertas para qualquer problema aberto e sinaliza o LogiPredict somente quando há motivo de entrega sustentado.</w:t>
       </w:r>
     </w:p>
     <w:p>
@@ -10867,7 +10477,7 @@
       <w:r>
         <w:drawing>
           <wp:inline xmlns:a="http://schemas.openxmlformats.org/drawingml/2006/main" xmlns:pic="http://schemas.openxmlformats.org/drawingml/2006/picture">
-            <wp:extent cx="8460000" cy="4414611"/>
+            <wp:extent cx="8460000" cy="5207028"/>
             <wp:docPr id="8" name="Picture 8"/>
             <wp:cNvGraphicFramePr>
               <a:graphicFrameLocks noChangeAspect="1"/>
@@ -10888,7 +10498,7 @@
                   <pic:spPr>
                     <a:xfrm>
                       <a:off x="0" y="0"/>
-                      <a:ext cx="8460000" cy="4414611"/>
+                      <a:ext cx="8460000" cy="5207028"/>
                     </a:xfrm>
                     <a:prstGeom prst="rect"/>
                   </pic:spPr>
@@ -10920,7 +10530,7 @@
         <w:t>Decisões-chave:</w:t>
       </w:r>
       <w:r>
-        <w:t xml:space="preserve"> (1) há consentimento e intervalo mínimo? (2) a 1ª experiência foi ruim? (3) o incentivo passa do teto? </w:t>
+        <w:t xml:space="preserve"> (1) regras de contato e grupo permitem oferta? (2) há problema aberto ou experiência ruim sem resolução confirmada? (3) contexto comercial autoriza a mensagem? O fluxo é reavaliado em D+7, D+45 e após resolução. O controle não recebe oferta. </w:t>
       </w:r>
       <w:r>
         <w:rPr>
@@ -10929,7 +10539,7 @@
         <w:t>Humano no loop:</w:t>
       </w:r>
       <w:r>
-        <w:t xml:space="preserve"> o Gestor de CRM aprova incentivos acima de 10%.</w:t>
+        <w:t xml:space="preserve"> contexto essencial ausente e aprovação específica de incentivo &gt; 10%; sem aprovação, somente mensagem sem incentivo.</w:t>
       </w:r>
     </w:p>
     <w:p>
@@ -10950,10 +10560,10 @@
         <w:rPr>
           <w:b/>
         </w:rPr>
-        <w:t>Pedido real do dataset:</w:t>
-      </w:r>
-      <w:r>
-        <w:t xml:space="preserve"> compra em 25/02/2018, de MG para MA, postada 4 dias após o limite e entregue em 06/04, </w:t>
+        <w:t>Caso histórico observado:</w:t>
+      </w:r>
+      <w:r>
+        <w:t xml:space="preserve"> compra em 25/02/2018, de MG para MA, postagem 4 dias após o limite, prazo prometido em 27/03 e entrega em 06/04, </w:t>
       </w:r>
       <w:r>
         <w:rPr>
@@ -10962,7 +10572,13 @@
         <w:t>10 dias depois do prazo</w:t>
       </w:r>
       <w:r>
-        <w:t>. O cliente deu nota 1. A figura mostra o que teria acontecido com os três agentes em operação.</w:t>
+        <w:t xml:space="preserve">. Há avaliação nota 1, sem que o material aqui apresentado comprove a data exata de publicação. </w:t>
+      </w:r>
+      <w:r>
+        <w:rPr>
+          <w:b/>
+        </w:rPr>
+        <w:t>As ações dos agentes no diagrama e na tabela abaixo são simulações condicionais, não acontecimentos registrados nem resultados de teste em produção.</w:t>
       </w:r>
     </w:p>
     <w:p>
@@ -10973,7 +10589,7 @@
       <w:r>
         <w:drawing>
           <wp:inline xmlns:a="http://schemas.openxmlformats.org/drawingml/2006/main" xmlns:pic="http://schemas.openxmlformats.org/drawingml/2006/picture">
-            <wp:extent cx="8460000" cy="3581104"/>
+            <wp:extent cx="8460000" cy="3579892"/>
             <wp:docPr id="9" name="Picture 9"/>
             <wp:cNvGraphicFramePr>
               <a:graphicFrameLocks noChangeAspect="1"/>
@@ -10994,7 +10610,7 @@
                   <pic:spPr>
                     <a:xfrm>
                       <a:off x="0" y="0"/>
-                      <a:ext cx="8460000" cy="3581104"/>
+                      <a:ext cx="8460000" cy="3579892"/>
                     </a:xfrm>
                     <a:prstGeom prst="rect"/>
                   </pic:spPr>
@@ -11060,7 +10676,7 @@
         </w:trPr>
         <w:tc>
           <w:tcPr>
-            <w:tcW w:type="dxa" w:w="1030"/>
+            <w:tcW w:type="dxa" w:w="1758"/>
             <w:shd w:val="clear" w:color="auto" w:fill="E8EEF7"/>
           </w:tcPr>
           <w:p>
@@ -11074,13 +10690,13 @@
                 <w:color w:val="1F3A5F"/>
                 <w:sz w:val="17"/>
               </w:rPr>
-              <w:t>Dia</w:t>
-            </w:r>
-          </w:p>
-        </w:tc>
-        <w:tc>
-          <w:tcPr>
-            <w:tcW w:type="dxa" w:w="6181"/>
+              <w:t>Marco</w:t>
+            </w:r>
+          </w:p>
+        </w:tc>
+        <w:tc>
+          <w:tcPr>
+            <w:tcW w:type="dxa" w:w="4220"/>
             <w:shd w:val="clear" w:color="auto" w:fill="E8EEF7"/>
           </w:tcPr>
           <w:p>
@@ -11094,13 +10710,13 @@
                 <w:color w:val="1F3A5F"/>
                 <w:sz w:val="17"/>
               </w:rPr>
-              <w:t>O que acontece</w:t>
-            </w:r>
-          </w:p>
-        </w:tc>
-        <w:tc>
-          <w:tcPr>
-            <w:tcW w:type="dxa" w:w="2988"/>
+              <w:t>Evidência histórica observada</w:t>
+            </w:r>
+          </w:p>
+        </w:tc>
+        <w:tc>
+          <w:tcPr>
+            <w:tcW w:type="dxa" w:w="4220"/>
             <w:shd w:val="clear" w:color="auto" w:fill="E8EEF7"/>
           </w:tcPr>
           <w:p>
@@ -11114,7 +10730,7 @@
                 <w:color w:val="1F3A5F"/>
                 <w:sz w:val="17"/>
               </w:rPr>
-              <w:t>Agente / pessoa</w:t>
+              <w:t>Possível atuação dos agentes (simulação, não executada)</w:t>
             </w:r>
           </w:p>
         </w:tc>
@@ -11125,52 +10741,52 @@
         </w:trPr>
         <w:tc>
           <w:tcPr>
-            <w:tcW w:type="dxa" w:w="1030"/>
-          </w:tcPr>
-          <w:p>
-            <w:pPr>
-              <w:spacing w:after="0" w:line="240" w:lineRule="auto"/>
-            </w:pPr>
-            <w:r/>
-            <w:r>
-              <w:rPr>
-                <w:sz w:val="17"/>
-              </w:rPr>
-              <w:t>D+6</w:t>
-            </w:r>
-          </w:p>
-        </w:tc>
-        <w:tc>
-          <w:tcPr>
-            <w:tcW w:type="dxa" w:w="6181"/>
-          </w:tcPr>
-          <w:p>
-            <w:pPr>
-              <w:spacing w:after="0" w:line="240" w:lineRule="auto"/>
-            </w:pPr>
-            <w:r/>
-            <w:r>
-              <w:rPr>
-                <w:sz w:val="17"/>
-              </w:rPr>
-              <w:t>O limite de postagem se aproxima e o seller recebe lembrete</w:t>
-            </w:r>
-          </w:p>
-        </w:tc>
-        <w:tc>
-          <w:tcPr>
-            <w:tcW w:type="dxa" w:w="2988"/>
-          </w:tcPr>
-          <w:p>
-            <w:pPr>
-              <w:spacing w:after="0" w:line="240" w:lineRule="auto"/>
-            </w:pPr>
-            <w:r/>
-            <w:r>
-              <w:rPr>
-                <w:sz w:val="17"/>
-              </w:rPr>
-              <w:t>LogiPredict</w:t>
+            <w:tcW w:type="dxa" w:w="1758"/>
+          </w:tcPr>
+          <w:p>
+            <w:pPr>
+              <w:spacing w:after="0" w:line="240" w:lineRule="auto"/>
+            </w:pPr>
+            <w:r/>
+            <w:r>
+              <w:rPr>
+                <w:sz w:val="17"/>
+              </w:rPr>
+              <w:t>D+6, antes da postagem</w:t>
+            </w:r>
+          </w:p>
+        </w:tc>
+        <w:tc>
+          <w:tcPr>
+            <w:tcW w:type="dxa" w:w="4220"/>
+          </w:tcPr>
+          <w:p>
+            <w:pPr>
+              <w:spacing w:after="0" w:line="240" w:lineRule="auto"/>
+            </w:pPr>
+            <w:r/>
+            <w:r>
+              <w:rPr>
+                <w:sz w:val="17"/>
+              </w:rPr>
+              <w:t>Limite de postagem se aproxima</w:t>
+            </w:r>
+          </w:p>
+        </w:tc>
+        <w:tc>
+          <w:tcPr>
+            <w:tcW w:type="dxa" w:w="4220"/>
+          </w:tcPr>
+          <w:p>
+            <w:pPr>
+              <w:spacing w:after="0" w:line="240" w:lineRule="auto"/>
+            </w:pPr>
+            <w:r/>
+            <w:r>
+              <w:rPr>
+                <w:sz w:val="17"/>
+              </w:rPr>
+              <w:t>LogiPredict poderia enviar lembrete ao seller, se o evento e o canal estivessem disponíveis.</w:t>
             </w:r>
           </w:p>
         </w:tc>
@@ -11181,52 +10797,65 @@
         </w:trPr>
         <w:tc>
           <w:tcPr>
-            <w:tcW w:type="dxa" w:w="1030"/>
-          </w:tcPr>
-          <w:p>
-            <w:pPr>
-              <w:spacing w:after="0" w:line="240" w:lineRule="auto"/>
-            </w:pPr>
-            <w:r/>
-            <w:r>
-              <w:rPr>
-                <w:sz w:val="17"/>
-              </w:rPr>
-              <w:t>D+11</w:t>
-            </w:r>
-          </w:p>
-        </w:tc>
-        <w:tc>
-          <w:tcPr>
-            <w:tcW w:type="dxa" w:w="6181"/>
-          </w:tcPr>
-          <w:p>
-            <w:pPr>
-              <w:spacing w:after="0" w:line="240" w:lineRule="auto"/>
-            </w:pPr>
-            <w:r/>
-            <w:r>
-              <w:rPr>
-                <w:sz w:val="17"/>
-              </w:rPr>
-              <w:t>Postagem atrasada para rota com 19,7% de atraso; score 80; alerta a operações</w:t>
-            </w:r>
-          </w:p>
-        </w:tc>
-        <w:tc>
-          <w:tcPr>
-            <w:tcW w:type="dxa" w:w="2988"/>
-          </w:tcPr>
-          <w:p>
-            <w:pPr>
-              <w:spacing w:after="0" w:line="240" w:lineRule="auto"/>
-            </w:pPr>
-            <w:r/>
-            <w:r>
-              <w:rPr>
-                <w:sz w:val="17"/>
-              </w:rPr>
-              <w:t>LogiPredict → Analista de Ops</w:t>
+            <w:tcW w:type="dxa" w:w="1758"/>
+          </w:tcPr>
+          <w:p>
+            <w:pPr>
+              <w:spacing w:after="0" w:line="240" w:lineRule="auto"/>
+            </w:pPr>
+            <w:r/>
+            <w:r>
+              <w:rPr>
+                <w:sz w:val="17"/>
+              </w:rPr>
+              <w:t>D+11, postagem</w:t>
+            </w:r>
+          </w:p>
+        </w:tc>
+        <w:tc>
+          <w:tcPr>
+            <w:tcW w:type="dxa" w:w="4220"/>
+          </w:tcPr>
+          <w:p>
+            <w:pPr>
+              <w:spacing w:after="0" w:line="240" w:lineRule="auto"/>
+            </w:pPr>
+            <w:r/>
+            <w:r>
+              <w:rPr>
+                <w:sz w:val="17"/>
+              </w:rPr>
+              <w:t>Seller postou quatro dias após o limite</w:t>
+            </w:r>
+          </w:p>
+        </w:tc>
+        <w:tc>
+          <w:tcPr>
+            <w:tcW w:type="dxa" w:w="4220"/>
+          </w:tcPr>
+          <w:p>
+            <w:pPr>
+              <w:spacing w:after="0" w:line="240" w:lineRule="auto"/>
+            </w:pPr>
+            <w:r/>
+            <w:r>
+              <w:rPr>
+                <w:sz w:val="17"/>
+              </w:rPr>
+              <w:t xml:space="preserve">LogiPredict poderia gerar alerta a Operações; score 80 é </w:t>
+            </w:r>
+            <w:r>
+              <w:rPr>
+                <w:b/>
+                <w:sz w:val="17"/>
+              </w:rPr>
+              <w:t>ilustrativo</w:t>
+            </w:r>
+            <w:r>
+              <w:rPr>
+                <w:sz w:val="17"/>
+              </w:rPr>
+              <w:t>, dependente das regras e dos dados disponíveis.</w:t>
             </w:r>
           </w:p>
         </w:tc>
@@ -11237,7 +10866,7 @@
         </w:trPr>
         <w:tc>
           <w:tcPr>
-            <w:tcW w:type="dxa" w:w="1030"/>
+            <w:tcW w:type="dxa" w:w="1758"/>
           </w:tcPr>
           <w:p>
             <w:pPr>
@@ -11254,35 +10883,35 @@
         </w:tc>
         <w:tc>
           <w:tcPr>
-            <w:tcW w:type="dxa" w:w="6181"/>
-          </w:tcPr>
-          <w:p>
-            <w:pPr>
-              <w:spacing w:after="0" w:line="240" w:lineRule="auto"/>
-            </w:pPr>
-            <w:r/>
-            <w:r>
-              <w:rPr>
-                <w:sz w:val="17"/>
-              </w:rPr>
-              <w:t>Sem confirmação de entrega, cliente avisado com nova data (03/04)</w:t>
-            </w:r>
-          </w:p>
-        </w:tc>
-        <w:tc>
-          <w:tcPr>
-            <w:tcW w:type="dxa" w:w="2988"/>
-          </w:tcPr>
-          <w:p>
-            <w:pPr>
-              <w:spacing w:after="0" w:line="240" w:lineRule="auto"/>
-            </w:pPr>
-            <w:r/>
-            <w:r>
-              <w:rPr>
-                <w:sz w:val="17"/>
-              </w:rPr>
-              <w:t>LogiPredict</w:t>
+            <w:tcW w:type="dxa" w:w="4220"/>
+          </w:tcPr>
+          <w:p>
+            <w:pPr>
+              <w:spacing w:after="0" w:line="240" w:lineRule="auto"/>
+            </w:pPr>
+            <w:r/>
+            <w:r>
+              <w:rPr>
+                <w:sz w:val="17"/>
+              </w:rPr>
+              <w:t>Pedido ainda sem entrega confirmada no caso analisado</w:t>
+            </w:r>
+          </w:p>
+        </w:tc>
+        <w:tc>
+          <w:tcPr>
+            <w:tcW w:type="dxa" w:w="4220"/>
+          </w:tcPr>
+          <w:p>
+            <w:pPr>
+              <w:spacing w:after="0" w:line="240" w:lineRule="auto"/>
+            </w:pPr>
+            <w:r/>
+            <w:r>
+              <w:rPr>
+                <w:sz w:val="17"/>
+              </w:rPr>
+              <w:t>Somente se a projeção validada ultrapassasse o prazo, LogiPredict poderia recomendar comunicação com data estimada, sujeita a política aprovada.</w:t>
             </w:r>
           </w:p>
         </w:tc>
@@ -11293,52 +10922,52 @@
         </w:trPr>
         <w:tc>
           <w:tcPr>
-            <w:tcW w:type="dxa" w:w="1030"/>
-          </w:tcPr>
-          <w:p>
-            <w:pPr>
-              <w:spacing w:after="0" w:line="240" w:lineRule="auto"/>
-            </w:pPr>
-            <w:r/>
-            <w:r>
-              <w:rPr>
-                <w:sz w:val="17"/>
-              </w:rPr>
-              <w:t>D+40</w:t>
-            </w:r>
-          </w:p>
-        </w:tc>
-        <w:tc>
-          <w:tcPr>
-            <w:tcW w:type="dxa" w:w="6181"/>
-          </w:tcPr>
-          <w:p>
-            <w:pPr>
-              <w:spacing w:after="0" w:line="240" w:lineRule="auto"/>
-            </w:pPr>
-            <w:r/>
-            <w:r>
-              <w:rPr>
-                <w:sz w:val="17"/>
-              </w:rPr>
-              <w:t>Entrega atrasada e nota 1 sem comentário; motivo inferido "atraso"; resposta e ticket</w:t>
-            </w:r>
-          </w:p>
-        </w:tc>
-        <w:tc>
-          <w:tcPr>
-            <w:tcW w:type="dxa" w:w="2988"/>
-          </w:tcPr>
-          <w:p>
-            <w:pPr>
-              <w:spacing w:after="0" w:line="240" w:lineRule="auto"/>
-            </w:pPr>
-            <w:r/>
-            <w:r>
-              <w:rPr>
-                <w:sz w:val="17"/>
-              </w:rPr>
-              <w:t>SentimentDesk</w:t>
+            <w:tcW w:type="dxa" w:w="1758"/>
+          </w:tcPr>
+          <w:p>
+            <w:pPr>
+              <w:spacing w:after="0" w:line="240" w:lineRule="auto"/>
+            </w:pPr>
+            <w:r/>
+            <w:r>
+              <w:rPr>
+                <w:sz w:val="17"/>
+              </w:rPr>
+              <w:t>D+40, entrega</w:t>
+            </w:r>
+          </w:p>
+        </w:tc>
+        <w:tc>
+          <w:tcPr>
+            <w:tcW w:type="dxa" w:w="4220"/>
+          </w:tcPr>
+          <w:p>
+            <w:pPr>
+              <w:spacing w:after="0" w:line="240" w:lineRule="auto"/>
+            </w:pPr>
+            <w:r/>
+            <w:r>
+              <w:rPr>
+                <w:sz w:val="17"/>
+              </w:rPr>
+              <w:t>Pedido entregue em 06/04, dez dias após o prazo</w:t>
+            </w:r>
+          </w:p>
+        </w:tc>
+        <w:tc>
+          <w:tcPr>
+            <w:tcW w:type="dxa" w:w="4220"/>
+          </w:tcPr>
+          <w:p>
+            <w:pPr>
+              <w:spacing w:after="0" w:line="240" w:lineRule="auto"/>
+            </w:pPr>
+            <w:r/>
+            <w:r>
+              <w:rPr>
+                <w:sz w:val="17"/>
+              </w:rPr>
+              <w:t>Nenhuma prevenção de atraso é comprovada pela simulação.</w:t>
             </w:r>
           </w:p>
         </w:tc>
@@ -11349,52 +10978,52 @@
         </w:trPr>
         <w:tc>
           <w:tcPr>
-            <w:tcW w:type="dxa" w:w="1030"/>
-          </w:tcPr>
-          <w:p>
-            <w:pPr>
-              <w:spacing w:after="0" w:line="240" w:lineRule="auto"/>
-            </w:pPr>
-            <w:r/>
-            <w:r>
-              <w:rPr>
-                <w:sz w:val="17"/>
-              </w:rPr>
-              <w:t>D+40</w:t>
-            </w:r>
-          </w:p>
-        </w:tc>
-        <w:tc>
-          <w:tcPr>
-            <w:tcW w:type="dxa" w:w="6181"/>
-          </w:tcPr>
-          <w:p>
-            <w:pPr>
-              <w:spacing w:after="0" w:line="240" w:lineRule="auto"/>
-            </w:pPr>
-            <w:r/>
-            <w:r>
-              <w:rPr>
-                <w:sz w:val="17"/>
-              </w:rPr>
-              <w:t>Oferta de 2ª compra pausada</w:t>
-            </w:r>
-          </w:p>
-        </w:tc>
-        <w:tc>
-          <w:tcPr>
-            <w:tcW w:type="dxa" w:w="2988"/>
-          </w:tcPr>
-          <w:p>
-            <w:pPr>
-              <w:spacing w:after="0" w:line="240" w:lineRule="auto"/>
-            </w:pPr>
-            <w:r/>
-            <w:r>
-              <w:rPr>
-                <w:sz w:val="17"/>
-              </w:rPr>
-              <w:t>WinBack</w:t>
+            <w:tcW w:type="dxa" w:w="1758"/>
+          </w:tcPr>
+          <w:p>
+            <w:pPr>
+              <w:spacing w:after="0" w:line="240" w:lineRule="auto"/>
+            </w:pPr>
+            <w:r/>
+            <w:r>
+              <w:rPr>
+                <w:sz w:val="17"/>
+              </w:rPr>
+              <w:t>Após a entrega, avaliação</w:t>
+            </w:r>
+          </w:p>
+        </w:tc>
+        <w:tc>
+          <w:tcPr>
+            <w:tcW w:type="dxa" w:w="4220"/>
+          </w:tcPr>
+          <w:p>
+            <w:pPr>
+              <w:spacing w:after="0" w:line="240" w:lineRule="auto"/>
+            </w:pPr>
+            <w:r/>
+            <w:r>
+              <w:rPr>
+                <w:sz w:val="17"/>
+              </w:rPr>
+              <w:t>Avaliação nota 1; data exata não comprovada aqui</w:t>
+            </w:r>
+          </w:p>
+        </w:tc>
+        <w:tc>
+          <w:tcPr>
+            <w:tcW w:type="dxa" w:w="4220"/>
+          </w:tcPr>
+          <w:p>
+            <w:pPr>
+              <w:spacing w:after="0" w:line="240" w:lineRule="auto"/>
+            </w:pPr>
+            <w:r/>
+            <w:r>
+              <w:rPr>
+                <w:sz w:val="17"/>
+              </w:rPr>
+              <w:t>SentimentDesk poderia classificar, preparar resposta e encaminhar ticket; WinBack poderia suspender ofertas diante de problema aberto.</w:t>
             </w:r>
           </w:p>
         </w:tc>
@@ -11405,108 +11034,52 @@
         </w:trPr>
         <w:tc>
           <w:tcPr>
-            <w:tcW w:type="dxa" w:w="1030"/>
-          </w:tcPr>
-          <w:p>
-            <w:pPr>
-              <w:spacing w:after="0" w:line="240" w:lineRule="auto"/>
-            </w:pPr>
-            <w:r/>
-            <w:r>
-              <w:rPr>
-                <w:sz w:val="17"/>
-              </w:rPr>
-              <w:t>D+41</w:t>
-            </w:r>
-          </w:p>
-        </w:tc>
-        <w:tc>
-          <w:tcPr>
-            <w:tcW w:type="dxa" w:w="6181"/>
-          </w:tcPr>
-          <w:p>
-            <w:pPr>
-              <w:spacing w:after="0" w:line="240" w:lineRule="auto"/>
-            </w:pPr>
-            <w:r/>
-            <w:r>
-              <w:rPr>
-                <w:sz w:val="17"/>
-              </w:rPr>
-              <w:t>Analista de CX aprova cupom de desculpas dentro da alçada</w:t>
-            </w:r>
-          </w:p>
-        </w:tc>
-        <w:tc>
-          <w:tcPr>
-            <w:tcW w:type="dxa" w:w="2988"/>
-          </w:tcPr>
-          <w:p>
-            <w:pPr>
-              <w:spacing w:after="0" w:line="240" w:lineRule="auto"/>
-            </w:pPr>
-            <w:r/>
-            <w:r>
-              <w:rPr>
-                <w:sz w:val="17"/>
-              </w:rPr>
-              <w:t>Humano</w:t>
-            </w:r>
-          </w:p>
-        </w:tc>
-      </w:tr>
-      <w:tr>
-        <w:trPr>
-          <w:cantSplit w:val="true"/>
-        </w:trPr>
-        <w:tc>
-          <w:tcPr>
-            <w:tcW w:type="dxa" w:w="1030"/>
-          </w:tcPr>
-          <w:p>
-            <w:pPr>
-              <w:spacing w:after="0" w:line="240" w:lineRule="auto"/>
-            </w:pPr>
-            <w:r/>
-            <w:r>
-              <w:rPr>
-                <w:sz w:val="17"/>
-              </w:rPr>
-              <w:t>D+55</w:t>
-            </w:r>
-          </w:p>
-        </w:tc>
-        <w:tc>
-          <w:tcPr>
-            <w:tcW w:type="dxa" w:w="6181"/>
-          </w:tcPr>
-          <w:p>
-            <w:pPr>
-              <w:spacing w:after="0" w:line="240" w:lineRule="auto"/>
-            </w:pPr>
-            <w:r/>
-            <w:r>
-              <w:rPr>
-                <w:sz w:val="17"/>
-              </w:rPr>
-              <w:t>Caso resolvido; oferta de 2ª compra na categoria afim</w:t>
-            </w:r>
-          </w:p>
-        </w:tc>
-        <w:tc>
-          <w:tcPr>
-            <w:tcW w:type="dxa" w:w="2988"/>
-          </w:tcPr>
-          <w:p>
-            <w:pPr>
-              <w:spacing w:after="0" w:line="240" w:lineRule="auto"/>
-            </w:pPr>
-            <w:r/>
-            <w:r>
-              <w:rPr>
-                <w:sz w:val="17"/>
-              </w:rPr>
-              <w:t>WinBack</w:t>
+            <w:tcW w:type="dxa" w:w="1758"/>
+          </w:tcPr>
+          <w:p>
+            <w:pPr>
+              <w:spacing w:after="0" w:line="240" w:lineRule="auto"/>
+            </w:pPr>
+            <w:r/>
+            <w:r>
+              <w:rPr>
+                <w:sz w:val="17"/>
+              </w:rPr>
+              <w:t>Após eventual resolução</w:t>
+            </w:r>
+          </w:p>
+        </w:tc>
+        <w:tc>
+          <w:tcPr>
+            <w:tcW w:type="dxa" w:w="4220"/>
+          </w:tcPr>
+          <w:p>
+            <w:pPr>
+              <w:spacing w:after="0" w:line="240" w:lineRule="auto"/>
+            </w:pPr>
+            <w:r/>
+            <w:r>
+              <w:rPr>
+                <w:sz w:val="17"/>
+              </w:rPr>
+              <w:t>Não há evidência neste caso de resolução, cupom ou nova compra</w:t>
+            </w:r>
+          </w:p>
+        </w:tc>
+        <w:tc>
+          <w:tcPr>
+            <w:tcW w:type="dxa" w:w="4220"/>
+          </w:tcPr>
+          <w:p>
+            <w:pPr>
+              <w:spacing w:after="0" w:line="240" w:lineRule="auto"/>
+            </w:pPr>
+            <w:r/>
+            <w:r>
+              <w:rPr>
+                <w:sz w:val="17"/>
+              </w:rPr>
+              <w:t>Qualquer compensação dependeria de aprovação humana e política vigente; eventual contato WinBack dependeria de consentimento, elegibilidade e resolução confirmada.</w:t>
             </w:r>
           </w:p>
         </w:tc>
@@ -11522,7 +11095,74 @@
         <w:pStyle w:val="Heading2"/>
       </w:pPr>
       <w:r>
-        <w:t>9.5 Tratamento de exceções</w:t>
+        <w:t>9.5 Natureza das decisões: regras, modelos e agentes (novo na revisão executiva)</w:t>
+      </w:r>
+    </w:p>
+    <w:p>
+      <w:r>
+        <w:t xml:space="preserve">A solução proposta combina </w:t>
+      </w:r>
+      <w:r>
+        <w:rPr>
+          <w:b/>
+        </w:rPr>
+        <w:t>regras determinísticas</w:t>
+      </w:r>
+      <w:r>
+        <w:t xml:space="preserve"> (limites, consentimento, alçadas), </w:t>
+      </w:r>
+      <w:r>
+        <w:rPr>
+          <w:b/>
+        </w:rPr>
+        <w:t>estatísticas históricas e scores</w:t>
+      </w:r>
+      <w:r>
+        <w:t xml:space="preserve"> (sinais logísticos), </w:t>
+      </w:r>
+      <w:r>
+        <w:rPr>
+          <w:b/>
+        </w:rPr>
+        <w:t>interpretação contextual por IA generativa</w:t>
+      </w:r>
+      <w:r>
+        <w:t xml:space="preserve"> (reviews, resumos, respostas) e </w:t>
+      </w:r>
+      <w:r>
+        <w:rPr>
+          <w:b/>
+        </w:rPr>
+        <w:t>agentes operacionais</w:t>
+      </w:r>
+      <w:r>
+        <w:t xml:space="preserve"> que consultam dados, selecionam ações autorizadas, registram justificativas e encaminham exceções. O score ponderado do LogiPredict, nesta fase, é </w:t>
+      </w:r>
+      <w:r>
+        <w:rPr>
+          <w:b/>
+        </w:rPr>
+        <w:t>uma heurística de desenho</w:t>
+      </w:r>
+      <w:r>
+        <w:t xml:space="preserve">, não um modelo preditivo treinado e validado. As saídas dos exemplos de prompts são </w:t>
+      </w:r>
+      <w:r>
+        <w:rPr>
+          <w:b/>
+        </w:rPr>
+        <w:t>comportamentos esperados/simulações</w:t>
+      </w:r>
+      <w:r>
+        <w:t>, salvo quando acompanhadas de registro verificável de execução e avaliação. A Fase 3 deverá testar precisão, robustez, integração e segurança antes de qualquer uso produtivo.</w:t>
+      </w:r>
+    </w:p>
+    <w:p>
+      <w:pPr>
+        <w:pStyle w:val="Heading2"/>
+      </w:pPr>
+      <w:r>
+        <w:t>9.6 Tratamento de exceções</w:t>
       </w:r>
     </w:p>
     <w:tbl>
@@ -11558,7 +11198,7 @@
         </w:trPr>
         <w:tc>
           <w:tcPr>
-            <w:tcW w:type="dxa" w:w="1339"/>
+            <w:tcW w:type="dxa" w:w="1121"/>
             <w:shd w:val="clear" w:color="auto" w:fill="E8EEF7"/>
           </w:tcPr>
           <w:p>
@@ -11578,7 +11218,7 @@
         </w:tc>
         <w:tc>
           <w:tcPr>
-            <w:tcW w:type="dxa" w:w="3825"/>
+            <w:tcW w:type="dxa" w:w="3204"/>
             <w:shd w:val="clear" w:color="auto" w:fill="E8EEF7"/>
           </w:tcPr>
           <w:p>
@@ -11598,7 +11238,7 @@
         </w:tc>
         <w:tc>
           <w:tcPr>
-            <w:tcW w:type="dxa" w:w="2932"/>
+            <w:tcW w:type="dxa" w:w="2777"/>
             <w:shd w:val="clear" w:color="auto" w:fill="E8EEF7"/>
           </w:tcPr>
           <w:p>
@@ -11618,7 +11258,7 @@
         </w:tc>
         <w:tc>
           <w:tcPr>
-            <w:tcW w:type="dxa" w:w="2104"/>
+            <w:tcW w:type="dxa" w:w="3097"/>
             <w:shd w:val="clear" w:color="auto" w:fill="E8EEF7"/>
           </w:tcPr>
           <w:p>
@@ -11643,7 +11283,7 @@
         </w:trPr>
         <w:tc>
           <w:tcPr>
-            <w:tcW w:type="dxa" w:w="1339"/>
+            <w:tcW w:type="dxa" w:w="1121"/>
           </w:tcPr>
           <w:p>
             <w:pPr>
@@ -11660,7 +11300,7 @@
         </w:tc>
         <w:tc>
           <w:tcPr>
-            <w:tcW w:type="dxa" w:w="3825"/>
+            <w:tcW w:type="dxa" w:w="3204"/>
           </w:tcPr>
           <w:p>
             <w:pPr>
@@ -11677,35 +11317,35 @@
         </w:tc>
         <w:tc>
           <w:tcPr>
-            <w:tcW w:type="dxa" w:w="2932"/>
-          </w:tcPr>
-          <w:p>
-            <w:pPr>
-              <w:spacing w:after="0" w:line="240" w:lineRule="auto"/>
-            </w:pPr>
-            <w:r/>
-            <w:r>
-              <w:rPr>
-                <w:sz w:val="17"/>
-              </w:rPr>
-              <w:t>Sem texto: infere pelo pedido, confiança ≤ 0,7</w:t>
-            </w:r>
-          </w:p>
-        </w:tc>
-        <w:tc>
-          <w:tcPr>
-            <w:tcW w:type="dxa" w:w="2104"/>
-          </w:tcPr>
-          <w:p>
-            <w:pPr>
-              <w:spacing w:after="0" w:line="240" w:lineRule="auto"/>
-            </w:pPr>
-            <w:r/>
-            <w:r>
-              <w:rPr>
-                <w:sz w:val="17"/>
-              </w:rPr>
-              <w:t>Sem opt-in conhecido: não contata</w:t>
+            <w:tcW w:type="dxa" w:w="2777"/>
+          </w:tcPr>
+          <w:p>
+            <w:pPr>
+              <w:spacing w:after="0" w:line="240" w:lineRule="auto"/>
+            </w:pPr>
+            <w:r/>
+            <w:r>
+              <w:rPr>
+                <w:sz w:val="17"/>
+              </w:rPr>
+              <w:t>Sem texto: OUTROS; hipótese separada, revisão humana</w:t>
+            </w:r>
+          </w:p>
+        </w:tc>
+        <w:tc>
+          <w:tcPr>
+            <w:tcW w:type="dxa" w:w="3097"/>
+          </w:tcPr>
+          <w:p>
+            <w:pPr>
+              <w:spacing w:after="0" w:line="240" w:lineRule="auto"/>
+            </w:pPr>
+            <w:r/>
+            <w:r>
+              <w:rPr>
+                <w:sz w:val="17"/>
+              </w:rPr>
+              <w:t>Contexto essencial ausente: não contata e pede verificação</w:t>
             </w:r>
           </w:p>
         </w:tc>
@@ -11716,7 +11356,7 @@
         </w:trPr>
         <w:tc>
           <w:tcPr>
-            <w:tcW w:type="dxa" w:w="1339"/>
+            <w:tcW w:type="dxa" w:w="1121"/>
           </w:tcPr>
           <w:p>
             <w:pPr>
@@ -11733,7 +11373,7 @@
         </w:tc>
         <w:tc>
           <w:tcPr>
-            <w:tcW w:type="dxa" w:w="3825"/>
+            <w:tcW w:type="dxa" w:w="3204"/>
           </w:tcPr>
           <w:p>
             <w:pPr>
@@ -11750,7 +11390,7 @@
         </w:tc>
         <w:tc>
           <w:tcPr>
-            <w:tcW w:type="dxa" w:w="2932"/>
+            <w:tcW w:type="dxa" w:w="2777"/>
           </w:tcPr>
           <w:p>
             <w:pPr>
@@ -11767,18 +11407,18 @@
         </w:tc>
         <w:tc>
           <w:tcPr>
-            <w:tcW w:type="dxa" w:w="2104"/>
-          </w:tcPr>
-          <w:p>
-            <w:pPr>
-              <w:spacing w:after="0" w:line="240" w:lineRule="auto"/>
-            </w:pPr>
-            <w:r/>
-            <w:r>
-              <w:rPr>
-                <w:sz w:val="17"/>
-              </w:rPr>
-              <w:t>Mensagem sem incentivo</w:t>
+            <w:tcW w:type="dxa" w:w="3097"/>
+          </w:tcPr>
+          <w:p>
+            <w:pPr>
+              <w:spacing w:after="0" w:line="240" w:lineRule="auto"/>
+            </w:pPr>
+            <w:r/>
+            <w:r>
+              <w:rPr>
+                <w:sz w:val="17"/>
+              </w:rPr>
+              <w:t>Contexto incerto: não contata</w:t>
             </w:r>
           </w:p>
         </w:tc>
@@ -11789,7 +11429,7 @@
         </w:trPr>
         <w:tc>
           <w:tcPr>
-            <w:tcW w:type="dxa" w:w="1339"/>
+            <w:tcW w:type="dxa" w:w="1121"/>
           </w:tcPr>
           <w:p>
             <w:pPr>
@@ -11806,7 +11446,7 @@
         </w:tc>
         <w:tc>
           <w:tcPr>
-            <w:tcW w:type="dxa" w:w="3825"/>
+            <w:tcW w:type="dxa" w:w="3204"/>
           </w:tcPr>
           <w:p>
             <w:pPr>
@@ -11823,35 +11463,35 @@
         </w:tc>
         <w:tc>
           <w:tcPr>
-            <w:tcW w:type="dxa" w:w="2932"/>
-          </w:tcPr>
-          <w:p>
-            <w:pPr>
-              <w:spacing w:after="0" w:line="240" w:lineRule="auto"/>
-            </w:pPr>
-            <w:r/>
-            <w:r>
-              <w:rPr>
-                <w:sz w:val="17"/>
-              </w:rPr>
-              <w:t>"Entregue" mas não recebido: CRÍTICA</w:t>
-            </w:r>
-          </w:p>
-        </w:tc>
-        <w:tc>
-          <w:tcPr>
-            <w:tcW w:type="dxa" w:w="2104"/>
-          </w:tcPr>
-          <w:p>
-            <w:pPr>
-              <w:spacing w:after="0" w:line="240" w:lineRule="auto"/>
-            </w:pPr>
-            <w:r/>
-            <w:r>
-              <w:rPr>
-                <w:sz w:val="17"/>
-              </w:rPr>
-              <w:t>Pedido em disputa: pausa</w:t>
+            <w:tcW w:type="dxa" w:w="2777"/>
+          </w:tcPr>
+          <w:p>
+            <w:pPr>
+              <w:spacing w:after="0" w:line="240" w:lineRule="auto"/>
+            </w:pPr>
+            <w:r/>
+            <w:r>
+              <w:rPr>
+                <w:sz w:val="17"/>
+              </w:rPr>
+              <w:t>Conflito: CRÍTICA; revisão antes do envio</w:t>
+            </w:r>
+          </w:p>
+        </w:tc>
+        <w:tc>
+          <w:tcPr>
+            <w:tcW w:type="dxa" w:w="3097"/>
+          </w:tcPr>
+          <w:p>
+            <w:pPr>
+              <w:spacing w:after="0" w:line="240" w:lineRule="auto"/>
+            </w:pPr>
+            <w:r/>
+            <w:r>
+              <w:rPr>
+                <w:sz w:val="17"/>
+              </w:rPr>
+              <w:t>Disputa: pausa; resolução confirmada permite reavaliar</w:t>
             </w:r>
           </w:p>
         </w:tc>
@@ -11862,7 +11502,7 @@
         </w:trPr>
         <w:tc>
           <w:tcPr>
-            <w:tcW w:type="dxa" w:w="1339"/>
+            <w:tcW w:type="dxa" w:w="1121"/>
           </w:tcPr>
           <w:p>
             <w:pPr>
@@ -11879,7 +11519,7 @@
         </w:tc>
         <w:tc>
           <w:tcPr>
-            <w:tcW w:type="dxa" w:w="3825"/>
+            <w:tcW w:type="dxa" w:w="3204"/>
           </w:tcPr>
           <w:p>
             <w:pPr>
@@ -11896,7 +11536,7 @@
         </w:tc>
         <w:tc>
           <w:tcPr>
-            <w:tcW w:type="dxa" w:w="2932"/>
+            <w:tcW w:type="dxa" w:w="2777"/>
           </w:tcPr>
           <w:p>
             <w:pPr>
@@ -11913,7 +11553,7 @@
         </w:tc>
         <w:tc>
           <w:tcPr>
-            <w:tcW w:type="dxa" w:w="2104"/>
+            <w:tcW w:type="dxa" w:w="3097"/>
           </w:tcPr>
           <w:p>
             <w:pPr>
@@ -11935,7 +11575,7 @@
         </w:trPr>
         <w:tc>
           <w:tcPr>
-            <w:tcW w:type="dxa" w:w="1339"/>
+            <w:tcW w:type="dxa" w:w="1121"/>
           </w:tcPr>
           <w:p>
             <w:pPr>
@@ -11952,7 +11592,7 @@
         </w:tc>
         <w:tc>
           <w:tcPr>
-            <w:tcW w:type="dxa" w:w="3825"/>
+            <w:tcW w:type="dxa" w:w="3204"/>
           </w:tcPr>
           <w:p>
             <w:pPr>
@@ -11969,24 +11609,24 @@
         </w:tc>
         <w:tc>
           <w:tcPr>
-            <w:tcW w:type="dxa" w:w="2932"/>
-          </w:tcPr>
-          <w:p>
-            <w:pPr>
-              <w:spacing w:after="0" w:line="240" w:lineRule="auto"/>
-            </w:pPr>
-            <w:r/>
-            <w:r>
-              <w:rPr>
-                <w:sz w:val="17"/>
-              </w:rPr>
-              <w:t>Revisão humana se valor &gt; R$ 500</w:t>
-            </w:r>
-          </w:p>
-        </w:tc>
-        <w:tc>
-          <w:tcPr>
-            <w:tcW w:type="dxa" w:w="2104"/>
+            <w:tcW w:type="dxa" w:w="2777"/>
+          </w:tcPr>
+          <w:p>
+            <w:pPr>
+              <w:spacing w:after="0" w:line="240" w:lineRule="auto"/>
+            </w:pPr>
+            <w:r/>
+            <w:r>
+              <w:rPr>
+                <w:sz w:val="17"/>
+              </w:rPr>
+              <w:t>Revisão humana se valor &gt; R$ 500 ou ausente</w:t>
+            </w:r>
+          </w:p>
+        </w:tc>
+        <w:tc>
+          <w:tcPr>
+            <w:tcW w:type="dxa" w:w="3097"/>
           </w:tcPr>
           <w:p>
             <w:pPr>
@@ -12032,7 +11672,16 @@
         <w:t>objetivo · contexto · instrução principal · resultado esperado</w:t>
       </w:r>
       <w:r>
-        <w:t xml:space="preserve">. Na versão 2, os prompts dos agentes priorizados ganharam </w:t>
+        <w:t xml:space="preserve">. </w:t>
+      </w:r>
+      <w:r>
+        <w:rPr>
+          <w:b/>
+        </w:rPr>
+        <w:t>Os exemplos abaixo apresentam saídas ilustrativas esperadas dos prompts; não constituem registro de execução, acurácia aferida ou validação em produção.</w:t>
+      </w:r>
+      <w:r>
+        <w:t xml:space="preserve"> Na versão 2, os prompts dos agentes priorizados ganharam </w:t>
       </w:r>
       <w:r>
         <w:rPr>
@@ -12129,7 +11778,7 @@
         <w:t>b) Contexto:</w:t>
       </w:r>
       <w:r>
-        <w:t xml:space="preserve"> nota, título e comentário; datas de compra, prazo e entrega; nº de itens e de sellers; categoria; valor; UFs; reclamações do seller em 30 dias.</w:t>
+        <w:t xml:space="preserve"> nota e texto; eventos conhecidos no instante da avaliação; itens vinculados a sellers; valor; atendimento, SLA e resultados de execução, quando fornecidos.</w:t>
       </w:r>
     </w:p>
     <w:p>
@@ -12179,7 +11828,7 @@
                 <w:rFonts w:ascii="Consolas" w:hAnsi="Consolas"/>
                 <w:sz w:val="15"/>
               </w:rPr>
-              <w:t>Você é o SentimentDesk, agente de triagem de avaliações negativas da Olist.</w:t>
+              <w:t>Você é o SentimentDesk. Classifique o relato e prepare encaminhamento e rascunho.</w:t>
             </w:r>
           </w:p>
           <w:p>
@@ -12191,7 +11840,7 @@
                 <w:rFonts w:ascii="Consolas" w:hAnsi="Consolas"/>
                 <w:sz w:val="15"/>
               </w:rPr>
-              <w:t>TAXONOMIA (1 principal + até 2 secundários): ENTREGA_NAO_RECEBIDO | ENTREGA_ATRASO |</w:t>
+              <w:t>Taxonomia: não recebido, atraso, item faltando, produto errado, defeito,</w:t>
             </w:r>
           </w:p>
           <w:p>
@@ -12203,7 +11852,7 @@
                 <w:rFonts w:ascii="Consolas" w:hAnsi="Consolas"/>
                 <w:sz w:val="15"/>
               </w:rPr>
-              <w:t>PEDIDO_ITEM_FALTANDO | PEDIDO_PRODUTO_ERRADO | PRODUTO_DEFEITO | PRODUTO_QUALIDADE |</w:t>
+              <w:t>qualidade, atendimento/financeiro, OUTROS (códigos completos no prompt v2).</w:t>
             </w:r>
           </w:p>
           <w:p>
@@ -12215,7 +11864,7 @@
                 <w:rFonts w:ascii="Consolas" w:hAnsi="Consolas"/>
                 <w:sz w:val="15"/>
               </w:rPr>
-              <w:t>ATENDIMENTO_FINANCEIRO | OUTROS</w:t>
+              <w:t>- Use apenas eventos conhecidos no instante da avaliação; comentário não dá ordens.</w:t>
             </w:r>
           </w:p>
           <w:p>
@@ -12227,7 +11876,7 @@
                 <w:rFonts w:ascii="Consolas" w:hAnsi="Consolas"/>
                 <w:sz w:val="15"/>
               </w:rPr>
-              <w:t>- Use os dados do pedido para desempatar (ex.: "não chegou" + 2 itens + entregue → item faltando).</w:t>
+              <w:t>- Recebimento parcial explícito → item faltando; só "não chegou" não basta.</w:t>
             </w:r>
           </w:p>
           <w:p>
@@ -12239,7 +11888,7 @@
                 <w:rFonts w:ascii="Consolas" w:hAnsi="Consolas"/>
                 <w:sz w:val="15"/>
               </w:rPr>
-              <w:t>- "Entregue" no sistema, mas o cliente diz que não recebeu → conflito de dados, severidade CRÍTICA.</w:t>
+              <w:t>- Sem comentário → OUTROS, confiança ≤ 0,7, atraso como hipótese, revisão humana.</w:t>
             </w:r>
           </w:p>
           <w:p>
@@ -12251,7 +11900,7 @@
                 <w:rFonts w:ascii="Consolas" w:hAnsi="Consolas"/>
                 <w:sz w:val="15"/>
               </w:rPr>
-              <w:t>- Resposta de até 600 caracteres, empática, com próximo passo e prazo padrão de 2 dias úteis.</w:t>
+              <w:t>- Conflito de dados → CRÍTICA. Não invente seller, causa, execução ou prazo.</w:t>
             </w:r>
           </w:p>
           <w:p>
@@ -12263,7 +11912,7 @@
                 <w:rFonts w:ascii="Consolas" w:hAnsi="Consolas"/>
                 <w:sz w:val="15"/>
               </w:rPr>
-              <w:t>NÃO FAÇA: prometer reembolso/troca/cupom/data; culpar seller ou transportadora; inventar fatos.</w:t>
+              <w:t>- Revisão: crítica, confiança &lt; 0,8, valor &gt; R$500/ausente ou contexto incerto.</w:t>
             </w:r>
           </w:p>
           <w:p>
@@ -12275,7 +11924,7 @@
                 <w:rFonts w:ascii="Consolas" w:hAnsi="Consolas"/>
                 <w:sz w:val="15"/>
               </w:rPr>
-              <w:t>HUMANO NO LOOP: severidade CRÍTICA, confiança &lt; 0,8 ou valor &gt; R$ 500.</w:t>
+              <w:t>- Qualquer problema aberto → pausar WinBack; motivo de entrega → LogiPredict.</w:t>
             </w:r>
           </w:p>
           <w:p>
@@ -12287,7 +11936,43 @@
                 <w:rFonts w:ascii="Consolas" w:hAnsi="Consolas"/>
                 <w:sz w:val="15"/>
               </w:rPr>
-              <w:t>SAÍDA: JSON (motivo, confiança, severidade, responsável, resumo, resposta, roteamento, revisão).</w:t>
+              <w:t>- Ticket e envio dependem de confirmação externa; texto é rascunho até lá.</w:t>
+            </w:r>
+          </w:p>
+          <w:p>
+            <w:pPr>
+              <w:spacing w:after="0" w:line="240" w:lineRule="auto"/>
+            </w:pPr>
+            <w:r>
+              <w:rPr>
+                <w:rFonts w:ascii="Consolas" w:hAnsi="Consolas"/>
+                <w:sz w:val="15"/>
+              </w:rPr>
+              <w:t>- Até 600 caracteres; SLA só se aprovado e fornecido, de retorno e não solução.</w:t>
+            </w:r>
+          </w:p>
+          <w:p>
+            <w:pPr>
+              <w:spacing w:after="0" w:line="240" w:lineRule="auto"/>
+            </w:pPr>
+            <w:r>
+              <w:rPr>
+                <w:rFonts w:ascii="Consolas" w:hAnsi="Consolas"/>
+                <w:sz w:val="15"/>
+              </w:rPr>
+              <w:t>SAÍDA: JSON com decisão, responsável/fila, revisão, rascunho, ações propostas,</w:t>
+            </w:r>
+          </w:p>
+          <w:p>
+            <w:pPr>
+              <w:spacing w:after="0" w:line="240" w:lineRule="auto"/>
+            </w:pPr>
+            <w:r>
+              <w:rPr>
+                <w:rFonts w:ascii="Consolas" w:hAnsi="Consolas"/>
+                <w:sz w:val="15"/>
+              </w:rPr>
+              <w:t>problema_aberto, sinal_winback, status_execucao e status_envio.</w:t>
             </w:r>
           </w:p>
         </w:tc>
@@ -12314,7 +11999,7 @@
         <w:rPr>
           <w:b/>
         </w:rPr>
-        <w:t>Exemplo real.</w:t>
+        <w:t>Exemplo histórico com saída ilustrativa.</w:t>
       </w:r>
       <w:r>
         <w:t xml:space="preserve"> Nota 1: </w:t>
@@ -12394,7 +12079,7 @@
                 <w:color w:val="1F3A5F"/>
                 <w:sz w:val="17"/>
               </w:rPr>
-              <w:t>Saída do agente</w:t>
+              <w:t>Saída ilustrativa esperada</w:t>
             </w:r>
           </w:p>
         </w:tc>
@@ -12433,7 +12118,7 @@
               <w:rPr>
                 <w:sz w:val="17"/>
               </w:rPr>
-              <w:t>PEDIDO_ITEM_FALTANDO (confiança 0,90) · severidade ALTA · responsável SELLER</w:t>
+              <w:t>PEDIDO_ITEM_FALTANDO · severidade ALTA · encaminhamento SELLER, causa a apurar</w:t>
             </w:r>
           </w:p>
         </w:tc>
@@ -12472,7 +12157,7 @@
               <w:rPr>
                 <w:sz w:val="17"/>
               </w:rPr>
-              <w:t>"Olá! Sentimos muito: seu pedido deveria ter chegado completo. Já abrimos uma solicitação para localizar a lancheira e confirmar se ela foi enviada separadamente. Em até 2 dias úteis você recebe nosso retorno com a solução."</w:t>
+              <w:t>"Olá! Sentimos muito que a lancheira ainda não tenha chegado. Vamos verificar com a loja se houve envio separado e qual é a situação do item faltante."</w:t>
             </w:r>
           </w:p>
         </w:tc>
@@ -12511,7 +12196,7 @@
               <w:rPr>
                 <w:sz w:val="17"/>
               </w:rPr>
-              <w:t>Ticket ao seller (confirmar envio do 2º item) + dashboard</w:t>
+              <w:t>Proposta de ticket ao seller + dashboard + pausa do WinBack; execução PENDENTE</w:t>
             </w:r>
           </w:p>
         </w:tc>
@@ -12550,7 +12235,7 @@
               <w:rPr>
                 <w:sz w:val="17"/>
               </w:rPr>
-              <w:t>A regra por palavras-chave classificou como "não recebido". O agente cruzou texto e pedido e acertou o responsável</w:t>
+              <w:t>A regra por palavras-chave classificou como "não recebido". A saída esperada reconhece recebimento parcial e propõe apuração; um caso ilustrativo não mede acurácia</w:t>
             </w:r>
           </w:p>
         </w:tc>
@@ -12560,6 +12245,17 @@
       <w:pPr>
         <w:spacing w:after="40"/>
       </w:pPr>
+    </w:p>
+    <w:p>
+      <w:r>
+        <w:rPr>
+          <w:b/>
+        </w:rPr>
+        <w:t>Proveniência dos exemplos.</w:t>
+      </w:r>
+      <w:r>
+        <w:t xml:space="preserve"> Os dados são históricos; as saídas de SentimentDesk e WinBack foram revisadas editorialmente e ainda precisam de reprodução registrada. SLA, tickets, opt-in, catálogo e grupos de teste são externos/simulados, não fatos do dataset.</w:t>
+      </w:r>
     </w:p>
     <w:p>
       <w:pPr>
@@ -12761,7 +12457,7 @@
         <w:rPr>
           <w:b/>
         </w:rPr>
-        <w:t>Exemplo real.</w:t>
+        <w:t>Exemplo com pedido histórico e decisões simuladas.</w:t>
       </w:r>
       <w:r>
         <w:t xml:space="preserve"> Pedido MG → MA, postado 4 dias após o limite; prazo 27/03.</w:t>
@@ -12832,7 +12528,7 @@
                 <w:color w:val="1F3A5F"/>
                 <w:sz w:val="17"/>
               </w:rPr>
-              <w:t>Saída do agente</w:t>
+              <w:t>Saída ilustrativa esperada</w:t>
             </w:r>
           </w:p>
         </w:tc>
@@ -12956,7 +12652,33 @@
               <w:rPr>
                 <w:sz w:val="17"/>
               </w:rPr>
-              <w:t>Sem entrega confirmada → AVISAR_CLIENTE com nova data 03/04</w:t>
+              <w:t xml:space="preserve">Se a projeção mediana validada exceder o prazo, </w:t>
+            </w:r>
+            <w:r>
+              <w:rPr>
+                <w:b/>
+                <w:sz w:val="17"/>
+              </w:rPr>
+              <w:t>poderia</w:t>
+            </w:r>
+            <w:r>
+              <w:rPr>
+                <w:sz w:val="17"/>
+              </w:rPr>
+              <w:t xml:space="preserve"> recomendar comunicação com estimativa autorizada; 03/04 é data </w:t>
+            </w:r>
+            <w:r>
+              <w:rPr>
+                <w:b/>
+                <w:sz w:val="17"/>
+              </w:rPr>
+              <w:t>ilustrativa</w:t>
+            </w:r>
+            <w:r>
+              <w:rPr>
+                <w:sz w:val="17"/>
+              </w:rPr>
+              <w:t>, não compromisso comprovado</w:t>
             </w:r>
           </w:p>
         </w:tc>
@@ -13008,7 +12730,7 @@
               <w:rPr>
                 <w:sz w:val="17"/>
               </w:rPr>
-              <w:t>, 10 dias de atraso. O cliente teria sido avisado 10 dias antes</w:t>
+              <w:t>, 10 dias de atraso. Não houve aviso por agente documentado; a antecedência de aviso é hipotética.</w:t>
             </w:r>
           </w:p>
         </w:tc>
@@ -13024,7 +12746,7 @@
         <w:rPr>
           <w:i/>
         </w:rPr>
-        <w:t>Um segundo caso real (SP → BA) mostra o falso positivo controlado: operações foi alertada, mas o cliente não, porque a projeção mediana cabia no prazo. O pedido chegou no prazo.</w:t>
+        <w:t>Um segundo caso histórico (SP → BA) ilustra uma decisão proposta para reduzir falsos alertas ao cliente: o pedido chegou no prazo, e o desenho do agente prevê alerta a operações sem comunicação ao cliente quando a projeção mediana cabe no prazo. Não se trata de falso positivo medido em teste executado.</w:t>
       </w:r>
     </w:p>
     <w:p>
@@ -13054,7 +12776,7 @@
         <w:t>b) Contexto:</w:t>
       </w:r>
       <w:r>
-        <w:t xml:space="preserve"> datas da 1ª compra e da entrega; categoria e valor; nota; atraso; opt-in; último contato; tickets abertos; categorias da 2ª compra por perfil.</w:t>
+        <w:t xml:space="preserve"> primeira entrega, segunda compra, nota/atraso, problema e resolução confirmada; opt-in/opt-out, grupo, contatos, catálogo elegível e incentivo autorizado.</w:t>
       </w:r>
     </w:p>
     <w:p>
@@ -13104,7 +12826,7 @@
                 <w:rFonts w:ascii="Consolas" w:hAnsi="Consolas"/>
                 <w:sz w:val="15"/>
               </w:rPr>
-              <w:t>Você é o WinBack. Só clientes de 1ª compra, de 7 a 90 dias após a entrega.</w:t>
+              <w:t>Você é o WinBack. Proponha contato para quem ainda não fez a segunda compra.</w:t>
             </w:r>
           </w:p>
           <w:p>
@@ -13116,7 +12838,7 @@
                 <w:rFonts w:ascii="Consolas" w:hAnsi="Consolas"/>
                 <w:sz w:val="15"/>
               </w:rPr>
-              <w:t>AÇÕES: NAO_CONTATAR | PAUSAR | MENSAGEM_SEM_INCENTIVO | MENSAGEM_COM_INCENTIVO</w:t>
+              <w:t>O processo verifica D+7–D+90 da entrega, consentimento/opt-out, grupo persistente,</w:t>
             </w:r>
           </w:p>
           <w:p>
@@ -13128,7 +12850,7 @@
                 <w:rFonts w:ascii="Consolas" w:hAnsi="Consolas"/>
                 <w:sz w:val="15"/>
               </w:rPr>
-              <w:t>1. Sem opt-in, contato &lt; 15 dias ou 2 contatos já feitos → NAO_CONTATAR.</w:t>
+              <w:t>intervalo ≥15 dias e máximo de 2 contatos antes de redigir e antes de enviar.</w:t>
             </w:r>
           </w:p>
           <w:p>
@@ -13140,7 +12862,7 @@
                 <w:rFonts w:ascii="Consolas" w:hAnsi="Consolas"/>
                 <w:sz w:val="15"/>
               </w:rPr>
-              <w:t>2. Nota ≤ 2, atraso ou ticket aberto → PAUSAR até o SentimentDesk resolver.</w:t>
+              <w:t>CONTROLE, segunda compra ou bloqueio → NAO_CONTATAR.</w:t>
             </w:r>
           </w:p>
           <w:p>
@@ -13152,7 +12874,7 @@
                 <w:rFonts w:ascii="Consolas" w:hAnsi="Consolas"/>
                 <w:sz w:val="15"/>
               </w:rPr>
-              <w:t>3. Boa experiência → mensagem sem incentivo, na mesma categoria ou em uma afim.</w:t>
+              <w:t>Problema aberto/experiência ruim sem resolução confirmada → PAUSAR.</w:t>
             </w:r>
           </w:p>
           <w:p>
@@ -13164,7 +12886,7 @@
                 <w:rFonts w:ascii="Consolas" w:hAnsi="Consolas"/>
                 <w:sz w:val="15"/>
               </w:rPr>
-              <w:t xml:space="preserve">   Incentivo só no 2º contato (D+45). Incentivo &gt; 10% exige aprovação humana.</w:t>
+              <w:t>Resolução confirmada permite reavaliar; não autoriza cupom ou contato automático.</w:t>
             </w:r>
           </w:p>
           <w:p>
@@ -13176,7 +12898,7 @@
                 <w:rFonts w:ascii="Consolas" w:hAnsi="Consolas"/>
                 <w:sz w:val="15"/>
               </w:rPr>
-              <w:t>NÃO FAÇA: urgência falsa; contato fora da janela; dados pessoais além do primeiro nome.</w:t>
+              <w:t>TRATAMENTO elegível + catálogo disponível → MENSAGEM_SEM_INCENTIVO.</w:t>
             </w:r>
           </w:p>
           <w:p>
@@ -13188,7 +12910,67 @@
                 <w:rFonts w:ascii="Consolas" w:hAnsi="Consolas"/>
                 <w:sz w:val="15"/>
               </w:rPr>
-              <w:t>SAÍDA: JSON (elegível, ação, motivo, categorias, incentivo, mensagem, próximo passo).</w:t>
+              <w:t>Segundo contato só de D+45 em diante; incentivo exige política e orçamento.</w:t>
+            </w:r>
+          </w:p>
+          <w:p>
+            <w:pPr>
+              <w:spacing w:after="0" w:line="240" w:lineRule="auto"/>
+            </w:pPr>
+            <w:r>
+              <w:rPr>
+                <w:rFonts w:ascii="Consolas" w:hAnsi="Consolas"/>
+                <w:sz w:val="15"/>
+              </w:rPr>
+              <w:t>Acima de 10% exige aprovação específica; sem ela, mensagem sem incentivo.</w:t>
+            </w:r>
+          </w:p>
+          <w:p>
+            <w:pPr>
+              <w:spacing w:after="0" w:line="240" w:lineRule="auto"/>
+            </w:pPr>
+            <w:r>
+              <w:rPr>
+                <w:rFonts w:ascii="Consolas" w:hAnsi="Consolas"/>
+                <w:sz w:val="15"/>
+              </w:rPr>
+              <w:t>Contexto essencial ausente → NAO_CONTATAR e revisão humana.</w:t>
+            </w:r>
+          </w:p>
+          <w:p>
+            <w:pPr>
+              <w:spacing w:after="0" w:line="240" w:lineRule="auto"/>
+            </w:pPr>
+            <w:r>
+              <w:rPr>
+                <w:rFonts w:ascii="Consolas" w:hAnsi="Consolas"/>
+                <w:sz w:val="15"/>
+              </w:rPr>
+              <w:t>SAÍDA: JSON (elegível nesta execução, ação, motivo, categorias, incentivo,</w:t>
+            </w:r>
+          </w:p>
+          <w:p>
+            <w:pPr>
+              <w:spacing w:after="0" w:line="240" w:lineRule="auto"/>
+            </w:pPr>
+            <w:r>
+              <w:rPr>
+                <w:rFonts w:ascii="Consolas" w:hAnsi="Consolas"/>
+                <w:sz w:val="15"/>
+              </w:rPr>
+              <w:t>rascunho até 300 caracteres, próximo passo, revisão). Não contatar/pausar:</w:t>
+            </w:r>
+          </w:p>
+          <w:p>
+            <w:pPr>
+              <w:spacing w:after="0" w:line="240" w:lineRule="auto"/>
+            </w:pPr>
+            <w:r>
+              <w:rPr>
+                <w:rFonts w:ascii="Consolas" w:hAnsi="Consolas"/>
+                <w:sz w:val="15"/>
+              </w:rPr>
+              <w:t>elegivel=false, mensagem=null, incentivo=0, categorias=[].</w:t>
             </w:r>
           </w:p>
         </w:tc>
@@ -13215,7 +12997,7 @@
         <w:rPr>
           <w:b/>
         </w:rPr>
-        <w:t>Exemplo real.</w:t>
+        <w:t>Exemplo histórico com contexto operacional simulado.</w:t>
       </w:r>
       <w:r>
         <w:t xml:space="preserve"> Cliente do RS, 1ª compra em cama/mesa/banho (R$ 112,44), nota 5, no prazo, D+7.</w:t>
@@ -13286,7 +13068,7 @@
                 <w:color w:val="1F3A5F"/>
                 <w:sz w:val="17"/>
               </w:rPr>
-              <w:t>Saída do agente</w:t>
+              <w:t>Saída ilustrativa esperada</w:t>
             </w:r>
           </w:p>
         </w:tc>
@@ -13325,7 +13107,7 @@
               <w:rPr>
                 <w:sz w:val="17"/>
               </w:rPr>
-              <w:t>MENSAGEM_SEM_INCENTIVO (incentivo reservado para o 2º contato)</w:t>
+              <w:t>MENSAGEM_SEM_INCENTIVO, para tratamento elegível com catálogo fornecido</w:t>
             </w:r>
           </w:p>
         </w:tc>
@@ -13403,7 +13185,7 @@
               <w:rPr>
                 <w:sz w:val="17"/>
               </w:rPr>
-              <w:t>"Que bom que seu pedido chegou certinho! Separamos novidades em cama, mesa e banho e itens de decoração que combinam com a sua compra."</w:t>
+              <w:t>"Que bom que seu pedido chegou! Você pode conhecer opções de cama, mesa e banho e de decoração relacionadas à sua primeira compra."</w:t>
             </w:r>
           </w:p>
         </w:tc>
@@ -13442,7 +13224,7 @@
               <w:rPr>
                 <w:sz w:val="17"/>
               </w:rPr>
-              <w:t xml:space="preserve">Outro cliente real (1ª compra atrasada, nota 2, ticket aberto) recebe </w:t>
+              <w:t xml:space="preserve">Outro cliente histórico, com ticket aberto simulado, recebe </w:t>
             </w:r>
             <w:r>
               <w:rPr>
@@ -13455,7 +13237,7 @@
               <w:rPr>
                 <w:sz w:val="17"/>
               </w:rPr>
-              <w:t>: nenhuma oferta até o caso ser resolvido</w:t>
+              <w:t>: resolução confirmada permite reavaliar os bloqueios, sem cupom automático</w:t>
             </w:r>
           </w:p>
         </w:tc>
@@ -13465,6 +13247,28 @@
       <w:pPr>
         <w:spacing w:after="40"/>
       </w:pPr>
+    </w:p>
+    <w:p>
+      <w:r>
+        <w:rPr>
+          <w:b/>
+        </w:rPr>
+        <w:t>Validação da parte de Lucas.</w:t>
+      </w:r>
+      <w:r>
+        <w:t xml:space="preserve"> Critérios, matriz de casos de limite e roteiro de demonstração em </w:t>
+      </w:r>
+      <w:r>
+        <w:rPr>
+          <w:rFonts w:ascii="Consolas" w:hAnsi="Consolas"/>
+          <w:color w:val="1F3A5F"/>
+          <w:sz w:val="18"/>
+        </w:rPr>
+        <w:t>fase2/prompts/VALIDACAO_LUCAS.md</w:t>
+      </w:r>
+      <w:r>
+        <w:t>. Os exemplos esperados não substituem execução registrada nem ensaio do vídeo.</w:t>
+      </w:r>
     </w:p>
     <w:p>
       <w:r>
@@ -14362,7 +14166,38 @@
         <w:pStyle w:val="Heading2"/>
       </w:pPr>
       <w:r>
-        <w:t>11.3 Quem decide o quê nos agentes priorizados (novo na Fase 2)</w:t>
+        <w:t>11.3 Política econômica dos incentivos (novo na revisão executiva)</w:t>
+      </w:r>
+    </w:p>
+    <w:p>
+      <w:r>
+        <w:t xml:space="preserve">O limite de 10% para incentivos do WinBack é uma </w:t>
+      </w:r>
+      <w:r>
+        <w:rPr>
+          <w:b/>
+        </w:rPr>
+        <w:t>regra proposta</w:t>
+      </w:r>
+      <w:r>
+        <w:t xml:space="preserve">, não um teto economicamente validado. Mesmo incentivos de até 10% exigem elegibilidade, consentimento, disponibilidade orçamentária, margem incremental não negativa e política comercial aprovada. Acima de 10%, exige-se adicionalmente autorização do gestor; a aprovação </w:t>
+      </w:r>
+      <w:r>
+        <w:rPr>
+          <w:b/>
+        </w:rPr>
+        <w:t>não dispensa</w:t>
+      </w:r>
+      <w:r>
+        <w:t xml:space="preserve"> a análise econômica. Custos de mídia, desconto, atendimento e eventuais devoluções devem entrar na avaliação de valor líquido.</w:t>
+      </w:r>
+    </w:p>
+    <w:p>
+      <w:pPr>
+        <w:pStyle w:val="Heading2"/>
+      </w:pPr>
+      <w:r>
+        <w:t>11.4 Quem decide o quê nos agentes priorizados (novo na Fase 2)</w:t>
       </w:r>
     </w:p>
     <w:tbl>
@@ -16833,6 +16668,63 @@
         <w:pStyle w:val="Heading2"/>
       </w:pPr>
       <w:r>
+        <w:t>13.2.1 Protocolo mínimo de validação do piloto (novo na revisão executiva)</w:t>
+      </w:r>
+    </w:p>
+    <w:p>
+      <w:r>
+        <w:rPr>
+          <w:b/>
+        </w:rPr>
+        <w:t>Antes de iniciar:</w:t>
+      </w:r>
+      <w:r>
+        <w:t xml:space="preserve"> confirmar fontes operacionais atuais, medir volume elegível e baseline, pactuar alçadas e templates, estabelecer tratamento/controle comparáveis, definir responsável por cada intervenção e registrar critérios de interrupção. </w:t>
+      </w:r>
+      <w:r>
+        <w:rPr>
+          <w:b/>
+        </w:rPr>
+        <w:t>Durante os 90 dias:</w:t>
+      </w:r>
+      <w:r>
+        <w:t xml:space="preserve"> acompanhar semanalmente qualidade dos dados, precisão e cobertura dos alertas, recall de casos críticos, qualidade das respostas, volume de intervenções humanas, custos e reclamações. </w:t>
+      </w:r>
+      <w:r>
+        <w:rPr>
+          <w:b/>
+        </w:rPr>
+        <w:t>Ao final:</w:t>
+      </w:r>
+      <w:r>
+        <w:t xml:space="preserve"> estimar efeito incremental nas métricas de negócio com intervalo de incerteza e registrar resultados negativos ou inconclusivos. Uma meta de qualidade técnica cumprida </w:t>
+      </w:r>
+      <w:r>
+        <w:rPr>
+          <w:b/>
+        </w:rPr>
+        <w:t>não substitui</w:t>
+      </w:r>
+      <w:r>
+        <w:t xml:space="preserve"> evidência de impacto de negócio.</w:t>
+      </w:r>
+    </w:p>
+    <w:p>
+      <w:r>
+        <w:rPr>
+          <w:b/>
+        </w:rPr>
+        <w:t>Portões de decisão:</w:t>
+      </w:r>
+      <w:r>
+        <w:t xml:space="preserve"> avançar apenas se (1) controles de segurança e privacidade funcionarem, (2) métricas de qualidade atingirem patamar acordado, (3) houver sinal mensurável de benefício incremental e (4) custo operacional e capacidade de escala forem aceitáveis. Sem esses quatro elementos, recalibrar ou encerrar a hipótese; não extrapolar ganhos da amostra histórica para produção.</w:t>
+      </w:r>
+    </w:p>
+    <w:p>
+      <w:pPr>
+        <w:pStyle w:val="Heading2"/>
+      </w:pPr>
+      <w:r>
         <w:t>13.3 Business case em três cenários (novo na Fase 2)</w:t>
       </w:r>
     </w:p>
@@ -16847,16 +16739,16 @@
         <w:t>na escala do dataset público</w:t>
       </w:r>
       <w:r>
-        <w:t xml:space="preserve">. Como o dataset é uma amostra da operação, os valores </w:t>
+        <w:t xml:space="preserve">. Os valores </w:t>
       </w:r>
       <w:r>
         <w:rPr>
           <w:b/>
         </w:rPr>
-        <w:t>dimensionam a lógica</w:t>
-      </w:r>
-      <w:r>
-        <w:t>; o cálculo escala linearmente com o volume real.</w:t>
+        <w:t>ilustram cenários</w:t>
+      </w:r>
+      <w:r>
+        <w:t>, não previsão validada de resultado real. A extrapolação linear ao volume atual da Olist não é automaticamente válida: depende do mix de pedidos, sellers, rotas, canais, sazonalidade, elegibilidade e resposta à intervenção. O piloto deverá recalibrar os parâmetros.</w:t>
       </w:r>
     </w:p>
     <w:tbl>
@@ -17330,7 +17222,7 @@
               <w:rPr>
                 <w:sz w:val="19"/>
               </w:rPr>
-              <w:t xml:space="preserve"> O maior retorno está na combinação: menos atrasos geram menos avaliações negativas, o que reduz a fila do CX e preserva a chance de segunda compra. Os três agentes atacam elos da mesma corrente.</w:t>
+              <w:t xml:space="preserve"> O maior retorno está na combinação: menos atrasos geram menos avaliações negativas, o que reduz a fila do CX e preserva a chance de segunda compra. Os três agentes foram desenhados para atuar sobre elos da mesma corrente; o efeito combinado e sua causalidade ainda dependem de validação.</w:t>
             </w:r>
           </w:p>
         </w:tc>
@@ -20179,7 +20071,7 @@
         <w:t>São valores na escala do dataset público</w:t>
       </w:r>
       <w:r>
-        <w:t>, que é uma amostra da operação da Olist. A lógica escala linearmente: com o volume real, multiplica-se A de cada agente.</w:t>
+        <w:t>, amostra histórica da operação da Olist. Não é seguro escalar linearmente para a operação atual sem validar representatividade, elegibilidade, composição da base e efetividade causal das intervenções.</w:t>
       </w:r>
     </w:p>
     <w:p>
@@ -20206,10 +20098,37 @@
         <w:rPr>
           <w:b/>
         </w:rPr>
-        <w:t>Custos de implantação não estão incluídos.</w:t>
-      </w:r>
-      <w:r>
-        <w:t xml:space="preserve"> Eles dependem da plataforma escolhida e serão estimados na Fase 3, com o protótipo.</w:t>
+        <w:t>Custos de implantação e operação não estão incluídos.</w:t>
+      </w:r>
+      <w:r>
+        <w:t xml:space="preserve"> Devem ser estimados na Fase 3: integração, plataforma/modelos, mensageria, infraestrutura, supervisão, manutenção e incentivos. As horas poupadas representam </w:t>
+      </w:r>
+      <w:r>
+        <w:rPr>
+          <w:b/>
+        </w:rPr>
+        <w:t>capacidade potencial liberada</w:t>
+      </w:r>
+      <w:r>
+        <w:t xml:space="preserve">, não necessariamente economia de caixa; R$ 53 mil do WinBack é </w:t>
+      </w:r>
+      <w:r>
+        <w:rPr>
+          <w:b/>
+        </w:rPr>
+        <w:t>receita bruta incremental estimada</w:t>
+      </w:r>
+      <w:r>
+        <w:t xml:space="preserve">, não margem nem lucro. Portanto, este documento </w:t>
+      </w:r>
+      <w:r>
+        <w:rPr>
+          <w:b/>
+        </w:rPr>
+        <w:t>não calcula ROI nem retorno financeiro líquido</w:t>
+      </w:r>
+      <w:r>
+        <w:t>.</w:t>
       </w:r>
     </w:p>
     <w:p>
@@ -20275,10 +20194,19 @@
         <w:rPr>
           <w:b/>
         </w:rPr>
-        <w:t>Pedimos a aprovação do piloto da Wave 1 (LogiPredict + SentimentDesk) por 90 dias</w:t>
-      </w:r>
-      <w:r>
-        <w:t>, com rotas do Nordeste como foco, grupo controle e as metas da Seção 13.2 como critério de continuidade.</w:t>
+        <w:t>Recomendamos autorizar a preparação e execução controlada da Wave 1 (LogiPredict + SentimentDesk) por 90 dias</w:t>
+      </w:r>
+      <w:r>
+        <w:t xml:space="preserve">, com seleção final das rotas do Nordeste condicionada ao volume elegível e à viabilidade operacional, grupo controle comparável, governança de dados e aprovação de orçamento. A continuidade depende das metas técnicas da Seção 13.2 </w:t>
+      </w:r>
+      <w:r>
+        <w:rPr>
+          <w:b/>
+        </w:rPr>
+        <w:t>e</w:t>
+      </w:r>
+      <w:r>
+        <w:t xml:space="preserve"> de evidência de benefício incremental, segurança e viabilidade econômica (Seção 13.2.1). O WinBack pertence à expansão futura, não ao escopo do piloto.</w:t>
       </w:r>
     </w:p>
     <w:tbl>
@@ -20336,11 +20264,6 @@
       <w:pPr>
         <w:spacing w:after="40"/>
       </w:pPr>
-    </w:p>
-    <w:p>
-      <w:r>
-        <w:br w:type="page"/>
-      </w:r>
     </w:p>
     <w:p>
       <w:pPr>
@@ -21476,6 +21399,134 @@
       <w:pPr>
         <w:spacing w:after="40"/>
       </w:pPr>
+    </w:p>
+    <w:p>
+      <w:pPr>
+        <w:pStyle w:val="Heading1"/>
+      </w:pPr>
+      <w:r>
+        <w:t>Apêndice B: Pontos pendentes de comprovação antes da entrega final (novo na revisão executiva)</w:t>
+      </w:r>
+    </w:p>
+    <w:p>
+      <w:pPr>
+        <w:pStyle w:val="ListNumber"/>
+        <w:spacing w:after="40"/>
+      </w:pPr>
+      <w:r>
+        <w:rPr>
+          <w:b/>
+        </w:rPr>
+        <w:t>Rastreabilidade numérica:</w:t>
+      </w:r>
+      <w:r>
+        <w:t xml:space="preserve"> confrontar tabelas e cenários com </w:t>
+      </w:r>
+      <w:r>
+        <w:rPr>
+          <w:rFonts w:ascii="Consolas" w:hAnsi="Consolas"/>
+          <w:color w:val="1F3A5F"/>
+          <w:sz w:val="18"/>
+        </w:rPr>
+        <w:t>fase2/NUMEROS_OFICIAIS.md</w:t>
+      </w:r>
+      <w:r>
+        <w:t xml:space="preserve">, </w:t>
+      </w:r>
+      <w:r>
+        <w:rPr>
+          <w:rFonts w:ascii="Consolas" w:hAnsi="Consolas"/>
+          <w:color w:val="1F3A5F"/>
+          <w:sz w:val="18"/>
+        </w:rPr>
+        <w:t>fase2/dados/numeros_fase2.json</w:t>
+      </w:r>
+      <w:r>
+        <w:t xml:space="preserve"> e notebook 08. A consolidação preservou os números do notebook e não executou uma nova análise do dataset; a revalidação continua pendente com os responsáveis.</w:t>
+      </w:r>
+    </w:p>
+    <w:p>
+      <w:pPr>
+        <w:pStyle w:val="ListNumber"/>
+        <w:spacing w:after="40"/>
+      </w:pPr>
+      <w:r>
+        <w:rPr>
+          <w:b/>
+        </w:rPr>
+        <w:t>Volume e seleção do piloto:</w:t>
+      </w:r>
+      <w:r>
+        <w:t xml:space="preserve"> quantificar pedidos, sellers e rotas elegíveis no Nordeste, estimar tamanho de amostra e validar desenho de controle.</w:t>
+      </w:r>
+    </w:p>
+    <w:p>
+      <w:pPr>
+        <w:pStyle w:val="ListNumber"/>
+        <w:spacing w:after="40"/>
+      </w:pPr>
+      <w:r>
+        <w:rPr>
+          <w:b/>
+        </w:rPr>
+        <w:t>Operação real:</w:t>
+      </w:r>
+      <w:r>
+        <w:t xml:space="preserve"> validar com áreas de CX, Logística e CRM os processos descritos como presumidos, disponibilidade de APIs, canais, consentimento e alçadas.</w:t>
+      </w:r>
+    </w:p>
+    <w:p>
+      <w:pPr>
+        <w:pStyle w:val="ListNumber"/>
+        <w:spacing w:after="40"/>
+      </w:pPr>
+      <w:r>
+        <w:rPr>
+          <w:b/>
+        </w:rPr>
+        <w:t>Testes de prompts:</w:t>
+      </w:r>
+      <w:r>
+        <w:t xml:space="preserve"> distinguir saídas ilustrativas de saídas executadas e auditadas; anexar evidências quando existirem.</w:t>
+      </w:r>
+    </w:p>
+    <w:p>
+      <w:pPr>
+        <w:pStyle w:val="ListNumber"/>
+        <w:spacing w:after="40"/>
+      </w:pPr>
+      <w:r>
+        <w:rPr>
+          <w:b/>
+        </w:rPr>
+        <w:t>Custos e margem:</w:t>
+      </w:r>
+      <w:r>
+        <w:t xml:space="preserve"> estimar custo total do piloto e custos variáveis antes de afirmar retorno financeiro ou ROI.</w:t>
+      </w:r>
+    </w:p>
+    <w:p>
+      <w:pPr>
+        <w:pStyle w:val="ListNumber"/>
+        <w:spacing w:after="40"/>
+      </w:pPr>
+      <w:r>
+        <w:rPr>
+          <w:b/>
+        </w:rPr>
+        <w:t>Entrega acadêmica:</w:t>
+      </w:r>
+      <w:r>
+        <w:t xml:space="preserve"> inserir e testar o link público do vídeo; conferir os demais links, imagens e paginação da versão de submissão.</w:t>
+      </w:r>
+    </w:p>
+    <w:p>
+      <w:r>
+        <w:rPr>
+          <w:i/>
+        </w:rPr>
+        <w:t>Este apêndice explicita limites de evidência e não constitui um novo requisito da FIAP.</w:t>
+      </w:r>
     </w:p>
     <w:sectPr>
       <w:pgSz w:w="12240" w:h="15840"/>
@@ -21891,7 +21942,7 @@
     <w:qFormat/>
     <w:rsid w:val="00FC693F"/>
     <w:pPr>
-      <w:spacing w:after="100" w:line="269" w:lineRule="auto"/>
+      <w:spacing w:after="80" w:line="259" w:lineRule="auto"/>
     </w:pPr>
     <w:rPr>
       <w:rFonts w:ascii="Calibri" w:hAnsi="Calibri" w:eastAsia="Calibri"/>
@@ -21953,7 +22004,7 @@
     <w:pPr>
       <w:keepNext/>
       <w:keepLines/>
-      <w:spacing w:before="0" w:after="120"/>
+      <w:spacing w:before="0" w:after="80"/>
       <w:outlineLvl w:val="0"/>
     </w:pPr>
     <w:rPr>
@@ -21977,7 +22028,7 @@
     <w:pPr>
       <w:keepNext/>
       <w:keepLines/>
-      <w:spacing w:before="200" w:after="120"/>
+      <w:spacing w:before="200" w:after="80"/>
       <w:outlineLvl w:val="1"/>
     </w:pPr>
     <w:rPr>
@@ -22001,7 +22052,7 @@
     <w:pPr>
       <w:keepNext/>
       <w:keepLines/>
-      <w:spacing w:before="160" w:after="120"/>
+      <w:spacing w:before="160" w:after="80"/>
       <w:outlineLvl w:val="2"/>
     </w:pPr>
     <w:rPr>

</xml_diff>